<commit_message>
27/8 v2 enviada a Manuel
</commit_message>
<xml_diff>
--- a/MemoriaTFM_2.docx
+++ b/MemoriaTFM_2.docx
@@ -281,7 +281,7 @@
           <w:color w:val="1F497D"/>
         </w:rPr>
       </w:pPr>
-      <w:bookmarkStart w:id="0" w:name="_Toc238733287"/>
+      <w:bookmarkStart w:id="0" w:name="_Toc238736040"/>
       <w:r>
         <w:rPr>
           <w:color w:val="1F497D"/>
@@ -336,7 +336,7 @@
         </w:rPr>
       </w:pPr>
       <w:bookmarkStart w:id="1" w:name="_Toc234787598"/>
-      <w:bookmarkStart w:id="2" w:name="_Toc238733288"/>
+      <w:bookmarkStart w:id="2" w:name="_Toc238736041"/>
       <w:r>
         <w:rPr>
           <w:color w:val="1F497D"/>
@@ -419,7 +419,7 @@
         </w:rPr>
       </w:pPr>
       <w:bookmarkStart w:id="3" w:name="_Toc234787599"/>
-      <w:bookmarkStart w:id="4" w:name="_Toc238733289"/>
+      <w:bookmarkStart w:id="4" w:name="_Toc238736042"/>
       <w:r>
         <w:rPr>
           <w:color w:val="1F497D" w:themeColor="text2"/>
@@ -551,7 +551,7 @@
           <w:r>
             <w:fldChar w:fldCharType="separate"/>
           </w:r>
-          <w:hyperlink w:anchor="_Toc238733287" w:history="1">
+          <w:hyperlink w:anchor="_Toc238736040" w:history="1">
             <w:r>
               <w:rPr>
                 <w:rStyle w:val="Hipervnculo"/>
@@ -574,7 +574,7 @@
               <w:rPr>
                 <w:webHidden/>
               </w:rPr>
-              <w:instrText xml:space="preserve"> PAGEREF _Toc238733287 \h </w:instrText>
+              <w:instrText xml:space="preserve"> PAGEREF _Toc238736040 \h </w:instrText>
             </w:r>
             <w:r>
               <w:rPr>
@@ -616,7 +616,7 @@
               <w14:ligatures w14:val="standardContextual"/>
             </w:rPr>
           </w:pPr>
-          <w:hyperlink w:anchor="_Toc238733288" w:history="1">
+          <w:hyperlink w:anchor="_Toc238736041" w:history="1">
             <w:r>
               <w:rPr>
                 <w:rStyle w:val="Hipervnculo"/>
@@ -639,7 +639,7 @@
               <w:rPr>
                 <w:webHidden/>
               </w:rPr>
-              <w:instrText xml:space="preserve"> PAGEREF _Toc238733288 \h </w:instrText>
+              <w:instrText xml:space="preserve"> PAGEREF _Toc238736041 \h </w:instrText>
             </w:r>
             <w:r>
               <w:rPr>
@@ -681,7 +681,7 @@
               <w14:ligatures w14:val="standardContextual"/>
             </w:rPr>
           </w:pPr>
-          <w:hyperlink w:anchor="_Toc238733289" w:history="1">
+          <w:hyperlink w:anchor="_Toc238736042" w:history="1">
             <w:r>
               <w:rPr>
                 <w:rStyle w:val="Hipervnculo"/>
@@ -704,7 +704,7 @@
               <w:rPr>
                 <w:webHidden/>
               </w:rPr>
-              <w:instrText xml:space="preserve"> PAGEREF _Toc238733289 \h </w:instrText>
+              <w:instrText xml:space="preserve"> PAGEREF _Toc238736042 \h </w:instrText>
             </w:r>
             <w:r>
               <w:rPr>
@@ -746,7 +746,7 @@
               <w14:ligatures w14:val="standardContextual"/>
             </w:rPr>
           </w:pPr>
-          <w:hyperlink w:anchor="_Toc238733290" w:history="1">
+          <w:hyperlink w:anchor="_Toc238736043" w:history="1">
             <w:r>
               <w:rPr>
                 <w:rStyle w:val="Hipervnculo"/>
@@ -769,7 +769,7 @@
               <w:rPr>
                 <w:webHidden/>
               </w:rPr>
-              <w:instrText xml:space="preserve"> PAGEREF _Toc238733290 \h </w:instrText>
+              <w:instrText xml:space="preserve"> PAGEREF _Toc238736043 \h </w:instrText>
             </w:r>
             <w:r>
               <w:rPr>
@@ -811,7 +811,7 @@
               <w14:ligatures w14:val="standardContextual"/>
             </w:rPr>
           </w:pPr>
-          <w:hyperlink w:anchor="_Toc238733291" w:history="1">
+          <w:hyperlink w:anchor="_Toc238736044" w:history="1">
             <w:r>
               <w:rPr>
                 <w:rStyle w:val="Hipervnculo"/>
@@ -834,7 +834,7 @@
               <w:rPr>
                 <w:webHidden/>
               </w:rPr>
-              <w:instrText xml:space="preserve"> PAGEREF _Toc238733291 \h </w:instrText>
+              <w:instrText xml:space="preserve"> PAGEREF _Toc238736044 \h </w:instrText>
             </w:r>
             <w:r>
               <w:rPr>
@@ -876,7 +876,7 @@
               <w14:ligatures w14:val="standardContextual"/>
             </w:rPr>
           </w:pPr>
-          <w:hyperlink w:anchor="_Toc238733292" w:history="1">
+          <w:hyperlink w:anchor="_Toc238736045" w:history="1">
             <w:r>
               <w:rPr>
                 <w:rStyle w:val="Hipervnculo"/>
@@ -899,7 +899,7 @@
               <w:rPr>
                 <w:webHidden/>
               </w:rPr>
-              <w:instrText xml:space="preserve"> PAGEREF _Toc238733292 \h </w:instrText>
+              <w:instrText xml:space="preserve"> PAGEREF _Toc238736045 \h </w:instrText>
             </w:r>
             <w:r>
               <w:rPr>
@@ -941,7 +941,7 @@
               <w14:ligatures w14:val="standardContextual"/>
             </w:rPr>
           </w:pPr>
-          <w:hyperlink w:anchor="_Toc238733293" w:history="1">
+          <w:hyperlink w:anchor="_Toc238736046" w:history="1">
             <w:r>
               <w:rPr>
                 <w:rStyle w:val="Hipervnculo"/>
@@ -964,7 +964,7 @@
               <w:rPr>
                 <w:webHidden/>
               </w:rPr>
-              <w:instrText xml:space="preserve"> PAGEREF _Toc238733293 \h </w:instrText>
+              <w:instrText xml:space="preserve"> PAGEREF _Toc238736046 \h </w:instrText>
             </w:r>
             <w:r>
               <w:rPr>
@@ -1006,7 +1006,7 @@
               <w14:ligatures w14:val="standardContextual"/>
             </w:rPr>
           </w:pPr>
-          <w:hyperlink w:anchor="_Toc238733294" w:history="1">
+          <w:hyperlink w:anchor="_Toc238736047" w:history="1">
             <w:r>
               <w:rPr>
                 <w:rStyle w:val="Hipervnculo"/>
@@ -1029,7 +1029,7 @@
               <w:rPr>
                 <w:webHidden/>
               </w:rPr>
-              <w:instrText xml:space="preserve"> PAGEREF _Toc238733294 \h </w:instrText>
+              <w:instrText xml:space="preserve"> PAGEREF _Toc238736047 \h </w:instrText>
             </w:r>
             <w:r>
               <w:rPr>
@@ -1071,7 +1071,7 @@
               <w14:ligatures w14:val="standardContextual"/>
             </w:rPr>
           </w:pPr>
-          <w:hyperlink w:anchor="_Toc238733295" w:history="1">
+          <w:hyperlink w:anchor="_Toc238736048" w:history="1">
             <w:r>
               <w:rPr>
                 <w:rStyle w:val="Hipervnculo"/>
@@ -1094,7 +1094,7 @@
               <w:rPr>
                 <w:webHidden/>
               </w:rPr>
-              <w:instrText xml:space="preserve"> PAGEREF _Toc238733295 \h </w:instrText>
+              <w:instrText xml:space="preserve"> PAGEREF _Toc238736048 \h </w:instrText>
             </w:r>
             <w:r>
               <w:rPr>
@@ -1136,7 +1136,7 @@
               <w14:ligatures w14:val="standardContextual"/>
             </w:rPr>
           </w:pPr>
-          <w:hyperlink w:anchor="_Toc238733296" w:history="1">
+          <w:hyperlink w:anchor="_Toc238736049" w:history="1">
             <w:r>
               <w:rPr>
                 <w:rStyle w:val="Hipervnculo"/>
@@ -1159,7 +1159,7 @@
               <w:rPr>
                 <w:webHidden/>
               </w:rPr>
-              <w:instrText xml:space="preserve"> PAGEREF _Toc238733296 \h </w:instrText>
+              <w:instrText xml:space="preserve"> PAGEREF _Toc238736049 \h </w:instrText>
             </w:r>
             <w:r>
               <w:rPr>
@@ -1201,7 +1201,7 @@
               <w14:ligatures w14:val="standardContextual"/>
             </w:rPr>
           </w:pPr>
-          <w:hyperlink w:anchor="_Toc238733297" w:history="1">
+          <w:hyperlink w:anchor="_Toc238736050" w:history="1">
             <w:r>
               <w:rPr>
                 <w:rStyle w:val="Hipervnculo"/>
@@ -1224,7 +1224,7 @@
               <w:rPr>
                 <w:webHidden/>
               </w:rPr>
-              <w:instrText xml:space="preserve"> PAGEREF _Toc238733297 \h </w:instrText>
+              <w:instrText xml:space="preserve"> PAGEREF _Toc238736050 \h </w:instrText>
             </w:r>
             <w:r>
               <w:rPr>
@@ -1266,7 +1266,7 @@
               <w14:ligatures w14:val="standardContextual"/>
             </w:rPr>
           </w:pPr>
-          <w:hyperlink w:anchor="_Toc238733298" w:history="1">
+          <w:hyperlink w:anchor="_Toc238736051" w:history="1">
             <w:r>
               <w:rPr>
                 <w:rStyle w:val="Hipervnculo"/>
@@ -1289,7 +1289,7 @@
               <w:rPr>
                 <w:webHidden/>
               </w:rPr>
-              <w:instrText xml:space="preserve"> PAGEREF _Toc238733298 \h </w:instrText>
+              <w:instrText xml:space="preserve"> PAGEREF _Toc238736051 \h </w:instrText>
             </w:r>
             <w:r>
               <w:rPr>
@@ -1331,7 +1331,7 @@
               <w14:ligatures w14:val="standardContextual"/>
             </w:rPr>
           </w:pPr>
-          <w:hyperlink w:anchor="_Toc238733299" w:history="1">
+          <w:hyperlink w:anchor="_Toc238736052" w:history="1">
             <w:r>
               <w:rPr>
                 <w:rStyle w:val="Hipervnculo"/>
@@ -1354,7 +1354,7 @@
               <w:rPr>
                 <w:webHidden/>
               </w:rPr>
-              <w:instrText xml:space="preserve"> PAGEREF _Toc238733299 \h </w:instrText>
+              <w:instrText xml:space="preserve"> PAGEREF _Toc238736052 \h </w:instrText>
             </w:r>
             <w:r>
               <w:rPr>
@@ -1371,7 +1371,7 @@
               <w:rPr>
                 <w:webHidden/>
               </w:rPr>
-              <w:t>17</w:t>
+              <w:t>16</w:t>
             </w:r>
             <w:r>
               <w:rPr>
@@ -1396,7 +1396,7 @@
               <w14:ligatures w14:val="standardContextual"/>
             </w:rPr>
           </w:pPr>
-          <w:hyperlink w:anchor="_Toc238733300" w:history="1">
+          <w:hyperlink w:anchor="_Toc238736053" w:history="1">
             <w:r>
               <w:rPr>
                 <w:rStyle w:val="Hipervnculo"/>
@@ -1419,7 +1419,7 @@
               <w:rPr>
                 <w:webHidden/>
               </w:rPr>
-              <w:instrText xml:space="preserve"> PAGEREF _Toc238733300 \h </w:instrText>
+              <w:instrText xml:space="preserve"> PAGEREF _Toc238736053 \h </w:instrText>
             </w:r>
             <w:r>
               <w:rPr>
@@ -1436,7 +1436,7 @@
               <w:rPr>
                 <w:webHidden/>
               </w:rPr>
-              <w:t>18</w:t>
+              <w:t>17</w:t>
             </w:r>
             <w:r>
               <w:rPr>
@@ -1461,7 +1461,7 @@
               <w14:ligatures w14:val="standardContextual"/>
             </w:rPr>
           </w:pPr>
-          <w:hyperlink w:anchor="_Toc238733301" w:history="1">
+          <w:hyperlink w:anchor="_Toc238736054" w:history="1">
             <w:r>
               <w:rPr>
                 <w:rStyle w:val="Hipervnculo"/>
@@ -1484,7 +1484,7 @@
               <w:rPr>
                 <w:webHidden/>
               </w:rPr>
-              <w:instrText xml:space="preserve"> PAGEREF _Toc238733301 \h </w:instrText>
+              <w:instrText xml:space="preserve"> PAGEREF _Toc238736054 \h </w:instrText>
             </w:r>
             <w:r>
               <w:rPr>
@@ -1501,7 +1501,7 @@
               <w:rPr>
                 <w:webHidden/>
               </w:rPr>
-              <w:t>18</w:t>
+              <w:t>17</w:t>
             </w:r>
             <w:r>
               <w:rPr>
@@ -1526,7 +1526,7 @@
               <w14:ligatures w14:val="standardContextual"/>
             </w:rPr>
           </w:pPr>
-          <w:hyperlink w:anchor="_Toc238733302" w:history="1">
+          <w:hyperlink w:anchor="_Toc238736055" w:history="1">
             <w:r>
               <w:rPr>
                 <w:rStyle w:val="Hipervnculo"/>
@@ -1549,7 +1549,7 @@
               <w:rPr>
                 <w:webHidden/>
               </w:rPr>
-              <w:instrText xml:space="preserve"> PAGEREF _Toc238733302 \h </w:instrText>
+              <w:instrText xml:space="preserve"> PAGEREF _Toc238736055 \h </w:instrText>
             </w:r>
             <w:r>
               <w:rPr>
@@ -1566,7 +1566,7 @@
               <w:rPr>
                 <w:webHidden/>
               </w:rPr>
-              <w:t>20</w:t>
+              <w:t>19</w:t>
             </w:r>
             <w:r>
               <w:rPr>
@@ -1591,7 +1591,7 @@
               <w14:ligatures w14:val="standardContextual"/>
             </w:rPr>
           </w:pPr>
-          <w:hyperlink w:anchor="_Toc238733303" w:history="1">
+          <w:hyperlink w:anchor="_Toc238736056" w:history="1">
             <w:r>
               <w:rPr>
                 <w:rStyle w:val="Hipervnculo"/>
@@ -1614,7 +1614,7 @@
               <w:rPr>
                 <w:webHidden/>
               </w:rPr>
-              <w:instrText xml:space="preserve"> PAGEREF _Toc238733303 \h </w:instrText>
+              <w:instrText xml:space="preserve"> PAGEREF _Toc238736056 \h </w:instrText>
             </w:r>
             <w:r>
               <w:rPr>
@@ -1631,7 +1631,7 @@
               <w:rPr>
                 <w:webHidden/>
               </w:rPr>
-              <w:t>20</w:t>
+              <w:t>19</w:t>
             </w:r>
             <w:r>
               <w:rPr>
@@ -1656,7 +1656,7 @@
               <w14:ligatures w14:val="standardContextual"/>
             </w:rPr>
           </w:pPr>
-          <w:hyperlink w:anchor="_Toc238733304" w:history="1">
+          <w:hyperlink w:anchor="_Toc238736057" w:history="1">
             <w:r>
               <w:rPr>
                 <w:rStyle w:val="Hipervnculo"/>
@@ -1679,7 +1679,7 @@
               <w:rPr>
                 <w:webHidden/>
               </w:rPr>
-              <w:instrText xml:space="preserve"> PAGEREF _Toc238733304 \h </w:instrText>
+              <w:instrText xml:space="preserve"> PAGEREF _Toc238736057 \h </w:instrText>
             </w:r>
             <w:r>
               <w:rPr>
@@ -1696,7 +1696,7 @@
               <w:rPr>
                 <w:webHidden/>
               </w:rPr>
-              <w:t>21</w:t>
+              <w:t>20</w:t>
             </w:r>
             <w:r>
               <w:rPr>
@@ -1721,7 +1721,7 @@
               <w14:ligatures w14:val="standardContextual"/>
             </w:rPr>
           </w:pPr>
-          <w:hyperlink w:anchor="_Toc238733305" w:history="1">
+          <w:hyperlink w:anchor="_Toc238736058" w:history="1">
             <w:r>
               <w:rPr>
                 <w:rStyle w:val="Hipervnculo"/>
@@ -1744,7 +1744,7 @@
               <w:rPr>
                 <w:webHidden/>
               </w:rPr>
-              <w:instrText xml:space="preserve"> PAGEREF _Toc238733305 \h </w:instrText>
+              <w:instrText xml:space="preserve"> PAGEREF _Toc238736058 \h </w:instrText>
             </w:r>
             <w:r>
               <w:rPr>
@@ -1761,7 +1761,7 @@
               <w:rPr>
                 <w:webHidden/>
               </w:rPr>
-              <w:t>23</w:t>
+              <w:t>22</w:t>
             </w:r>
             <w:r>
               <w:rPr>
@@ -1786,7 +1786,7 @@
               <w14:ligatures w14:val="standardContextual"/>
             </w:rPr>
           </w:pPr>
-          <w:hyperlink w:anchor="_Toc238733306" w:history="1">
+          <w:hyperlink w:anchor="_Toc238736059" w:history="1">
             <w:r>
               <w:rPr>
                 <w:rStyle w:val="Hipervnculo"/>
@@ -1809,7 +1809,7 @@
               <w:rPr>
                 <w:webHidden/>
               </w:rPr>
-              <w:instrText xml:space="preserve"> PAGEREF _Toc238733306 \h </w:instrText>
+              <w:instrText xml:space="preserve"> PAGEREF _Toc238736059 \h </w:instrText>
             </w:r>
             <w:r>
               <w:rPr>
@@ -1826,7 +1826,7 @@
               <w:rPr>
                 <w:webHidden/>
               </w:rPr>
-              <w:t>23</w:t>
+              <w:t>22</w:t>
             </w:r>
             <w:r>
               <w:rPr>
@@ -1851,7 +1851,7 @@
               <w14:ligatures w14:val="standardContextual"/>
             </w:rPr>
           </w:pPr>
-          <w:hyperlink w:anchor="_Toc238733307" w:history="1">
+          <w:hyperlink w:anchor="_Toc238736060" w:history="1">
             <w:r>
               <w:rPr>
                 <w:rStyle w:val="Hipervnculo"/>
@@ -1874,7 +1874,7 @@
               <w:rPr>
                 <w:webHidden/>
               </w:rPr>
-              <w:instrText xml:space="preserve"> PAGEREF _Toc238733307 \h </w:instrText>
+              <w:instrText xml:space="preserve"> PAGEREF _Toc238736060 \h </w:instrText>
             </w:r>
             <w:r>
               <w:rPr>
@@ -1891,7 +1891,7 @@
               <w:rPr>
                 <w:webHidden/>
               </w:rPr>
-              <w:t>25</w:t>
+              <w:t>24</w:t>
             </w:r>
             <w:r>
               <w:rPr>
@@ -1916,7 +1916,7 @@
               <w14:ligatures w14:val="standardContextual"/>
             </w:rPr>
           </w:pPr>
-          <w:hyperlink w:anchor="_Toc238733308" w:history="1">
+          <w:hyperlink w:anchor="_Toc238736061" w:history="1">
             <w:r>
               <w:rPr>
                 <w:rStyle w:val="Hipervnculo"/>
@@ -1939,7 +1939,7 @@
               <w:rPr>
                 <w:webHidden/>
               </w:rPr>
-              <w:instrText xml:space="preserve"> PAGEREF _Toc238733308 \h </w:instrText>
+              <w:instrText xml:space="preserve"> PAGEREF _Toc238736061 \h </w:instrText>
             </w:r>
             <w:r>
               <w:rPr>
@@ -1956,7 +1956,7 @@
               <w:rPr>
                 <w:webHidden/>
               </w:rPr>
-              <w:t>25</w:t>
+              <w:t>24</w:t>
             </w:r>
             <w:r>
               <w:rPr>
@@ -1981,7 +1981,7 @@
               <w14:ligatures w14:val="standardContextual"/>
             </w:rPr>
           </w:pPr>
-          <w:hyperlink w:anchor="_Toc238733309" w:history="1">
+          <w:hyperlink w:anchor="_Toc238736062" w:history="1">
             <w:r>
               <w:rPr>
                 <w:rStyle w:val="Hipervnculo"/>
@@ -2004,7 +2004,7 @@
               <w:rPr>
                 <w:webHidden/>
               </w:rPr>
-              <w:instrText xml:space="preserve"> PAGEREF _Toc238733309 \h </w:instrText>
+              <w:instrText xml:space="preserve"> PAGEREF _Toc238736062 \h </w:instrText>
             </w:r>
             <w:r>
               <w:rPr>
@@ -2021,7 +2021,7 @@
               <w:rPr>
                 <w:webHidden/>
               </w:rPr>
-              <w:t>27</w:t>
+              <w:t>26</w:t>
             </w:r>
             <w:r>
               <w:rPr>
@@ -2046,7 +2046,7 @@
               <w14:ligatures w14:val="standardContextual"/>
             </w:rPr>
           </w:pPr>
-          <w:hyperlink w:anchor="_Toc238733310" w:history="1">
+          <w:hyperlink w:anchor="_Toc238736063" w:history="1">
             <w:r>
               <w:rPr>
                 <w:rStyle w:val="Hipervnculo"/>
@@ -2069,7 +2069,7 @@
               <w:rPr>
                 <w:webHidden/>
               </w:rPr>
-              <w:instrText xml:space="preserve"> PAGEREF _Toc238733310 \h </w:instrText>
+              <w:instrText xml:space="preserve"> PAGEREF _Toc238736063 \h </w:instrText>
             </w:r>
             <w:r>
               <w:rPr>
@@ -2086,7 +2086,7 @@
               <w:rPr>
                 <w:webHidden/>
               </w:rPr>
-              <w:t>27</w:t>
+              <w:t>26</w:t>
             </w:r>
             <w:r>
               <w:rPr>
@@ -2111,7 +2111,7 @@
               <w14:ligatures w14:val="standardContextual"/>
             </w:rPr>
           </w:pPr>
-          <w:hyperlink w:anchor="_Toc238733311" w:history="1">
+          <w:hyperlink w:anchor="_Toc238736064" w:history="1">
             <w:r>
               <w:rPr>
                 <w:rStyle w:val="Hipervnculo"/>
@@ -2134,7 +2134,7 @@
               <w:rPr>
                 <w:webHidden/>
               </w:rPr>
-              <w:instrText xml:space="preserve"> PAGEREF _Toc238733311 \h </w:instrText>
+              <w:instrText xml:space="preserve"> PAGEREF _Toc238736064 \h </w:instrText>
             </w:r>
             <w:r>
               <w:rPr>
@@ -2151,7 +2151,7 @@
               <w:rPr>
                 <w:webHidden/>
               </w:rPr>
-              <w:t>28</w:t>
+              <w:t>27</w:t>
             </w:r>
             <w:r>
               <w:rPr>
@@ -2176,7 +2176,7 @@
               <w14:ligatures w14:val="standardContextual"/>
             </w:rPr>
           </w:pPr>
-          <w:hyperlink w:anchor="_Toc238733312" w:history="1">
+          <w:hyperlink w:anchor="_Toc238736065" w:history="1">
             <w:r>
               <w:rPr>
                 <w:rStyle w:val="Hipervnculo"/>
@@ -2199,7 +2199,7 @@
               <w:rPr>
                 <w:webHidden/>
               </w:rPr>
-              <w:instrText xml:space="preserve"> PAGEREF _Toc238733312 \h </w:instrText>
+              <w:instrText xml:space="preserve"> PAGEREF _Toc238736065 \h </w:instrText>
             </w:r>
             <w:r>
               <w:rPr>
@@ -2216,7 +2216,7 @@
               <w:rPr>
                 <w:webHidden/>
               </w:rPr>
-              <w:t>28</w:t>
+              <w:t>27</w:t>
             </w:r>
             <w:r>
               <w:rPr>
@@ -2241,7 +2241,7 @@
               <w14:ligatures w14:val="standardContextual"/>
             </w:rPr>
           </w:pPr>
-          <w:hyperlink w:anchor="_Toc238733313" w:history="1">
+          <w:hyperlink w:anchor="_Toc238736066" w:history="1">
             <w:r>
               <w:rPr>
                 <w:rStyle w:val="Hipervnculo"/>
@@ -2264,7 +2264,7 @@
               <w:rPr>
                 <w:webHidden/>
               </w:rPr>
-              <w:instrText xml:space="preserve"> PAGEREF _Toc238733313 \h </w:instrText>
+              <w:instrText xml:space="preserve"> PAGEREF _Toc238736066 \h </w:instrText>
             </w:r>
             <w:r>
               <w:rPr>
@@ -2281,7 +2281,7 @@
               <w:rPr>
                 <w:webHidden/>
               </w:rPr>
-              <w:t>30</w:t>
+              <w:t>29</w:t>
             </w:r>
             <w:r>
               <w:rPr>
@@ -2306,7 +2306,7 @@
               <w14:ligatures w14:val="standardContextual"/>
             </w:rPr>
           </w:pPr>
-          <w:hyperlink w:anchor="_Toc238733314" w:history="1">
+          <w:hyperlink w:anchor="_Toc238736067" w:history="1">
             <w:r>
               <w:rPr>
                 <w:rStyle w:val="Hipervnculo"/>
@@ -2329,7 +2329,7 @@
               <w:rPr>
                 <w:webHidden/>
               </w:rPr>
-              <w:instrText xml:space="preserve"> PAGEREF _Toc238733314 \h </w:instrText>
+              <w:instrText xml:space="preserve"> PAGEREF _Toc238736067 \h </w:instrText>
             </w:r>
             <w:r>
               <w:rPr>
@@ -2346,7 +2346,7 @@
               <w:rPr>
                 <w:webHidden/>
               </w:rPr>
-              <w:t>30</w:t>
+              <w:t>29</w:t>
             </w:r>
             <w:r>
               <w:rPr>
@@ -2371,7 +2371,7 @@
               <w14:ligatures w14:val="standardContextual"/>
             </w:rPr>
           </w:pPr>
-          <w:hyperlink w:anchor="_Toc238733315" w:history="1">
+          <w:hyperlink w:anchor="_Toc238736068" w:history="1">
             <w:r>
               <w:rPr>
                 <w:rStyle w:val="Hipervnculo"/>
@@ -2394,7 +2394,7 @@
               <w:rPr>
                 <w:webHidden/>
               </w:rPr>
-              <w:instrText xml:space="preserve"> PAGEREF _Toc238733315 \h </w:instrText>
+              <w:instrText xml:space="preserve"> PAGEREF _Toc238736068 \h </w:instrText>
             </w:r>
             <w:r>
               <w:rPr>
@@ -2411,7 +2411,7 @@
               <w:rPr>
                 <w:webHidden/>
               </w:rPr>
-              <w:t>30</w:t>
+              <w:t>29</w:t>
             </w:r>
             <w:r>
               <w:rPr>
@@ -2436,7 +2436,7 @@
               <w14:ligatures w14:val="standardContextual"/>
             </w:rPr>
           </w:pPr>
-          <w:hyperlink w:anchor="_Toc238733316" w:history="1">
+          <w:hyperlink w:anchor="_Toc238736069" w:history="1">
             <w:r>
               <w:rPr>
                 <w:rStyle w:val="Hipervnculo"/>
@@ -2459,7 +2459,7 @@
               <w:rPr>
                 <w:webHidden/>
               </w:rPr>
-              <w:instrText xml:space="preserve"> PAGEREF _Toc238733316 \h </w:instrText>
+              <w:instrText xml:space="preserve"> PAGEREF _Toc238736069 \h </w:instrText>
             </w:r>
             <w:r>
               <w:rPr>
@@ -2476,7 +2476,7 @@
               <w:rPr>
                 <w:webHidden/>
               </w:rPr>
-              <w:t>30</w:t>
+              <w:t>29</w:t>
             </w:r>
             <w:r>
               <w:rPr>
@@ -2501,7 +2501,7 @@
               <w14:ligatures w14:val="standardContextual"/>
             </w:rPr>
           </w:pPr>
-          <w:hyperlink w:anchor="_Toc238733317" w:history="1">
+          <w:hyperlink w:anchor="_Toc238736070" w:history="1">
             <w:r>
               <w:rPr>
                 <w:rStyle w:val="Hipervnculo"/>
@@ -2524,7 +2524,7 @@
               <w:rPr>
                 <w:webHidden/>
               </w:rPr>
-              <w:instrText xml:space="preserve"> PAGEREF _Toc238733317 \h </w:instrText>
+              <w:instrText xml:space="preserve"> PAGEREF _Toc238736070 \h </w:instrText>
             </w:r>
             <w:r>
               <w:rPr>
@@ -2541,7 +2541,7 @@
               <w:rPr>
                 <w:webHidden/>
               </w:rPr>
-              <w:t>32</w:t>
+              <w:t>31</w:t>
             </w:r>
             <w:r>
               <w:rPr>
@@ -2566,7 +2566,7 @@
               <w14:ligatures w14:val="standardContextual"/>
             </w:rPr>
           </w:pPr>
-          <w:hyperlink w:anchor="_Toc238733318" w:history="1">
+          <w:hyperlink w:anchor="_Toc238736071" w:history="1">
             <w:r>
               <w:rPr>
                 <w:rStyle w:val="Hipervnculo"/>
@@ -2589,7 +2589,7 @@
               <w:rPr>
                 <w:webHidden/>
               </w:rPr>
-              <w:instrText xml:space="preserve"> PAGEREF _Toc238733318 \h </w:instrText>
+              <w:instrText xml:space="preserve"> PAGEREF _Toc238736071 \h </w:instrText>
             </w:r>
             <w:r>
               <w:rPr>
@@ -2606,7 +2606,7 @@
               <w:rPr>
                 <w:webHidden/>
               </w:rPr>
-              <w:t>33</w:t>
+              <w:t>32</w:t>
             </w:r>
             <w:r>
               <w:rPr>
@@ -2631,7 +2631,7 @@
               <w14:ligatures w14:val="standardContextual"/>
             </w:rPr>
           </w:pPr>
-          <w:hyperlink w:anchor="_Toc238733319" w:history="1">
+          <w:hyperlink w:anchor="_Toc238736072" w:history="1">
             <w:r>
               <w:rPr>
                 <w:rStyle w:val="Hipervnculo"/>
@@ -2654,7 +2654,7 @@
               <w:rPr>
                 <w:webHidden/>
               </w:rPr>
-              <w:instrText xml:space="preserve"> PAGEREF _Toc238733319 \h </w:instrText>
+              <w:instrText xml:space="preserve"> PAGEREF _Toc238736072 \h </w:instrText>
             </w:r>
             <w:r>
               <w:rPr>
@@ -2671,7 +2671,7 @@
               <w:rPr>
                 <w:webHidden/>
               </w:rPr>
-              <w:t>33</w:t>
+              <w:t>32</w:t>
             </w:r>
             <w:r>
               <w:rPr>
@@ -2696,7 +2696,7 @@
               <w14:ligatures w14:val="standardContextual"/>
             </w:rPr>
           </w:pPr>
-          <w:hyperlink w:anchor="_Toc238733320" w:history="1">
+          <w:hyperlink w:anchor="_Toc238736073" w:history="1">
             <w:r>
               <w:rPr>
                 <w:rStyle w:val="Hipervnculo"/>
@@ -2719,7 +2719,7 @@
               <w:rPr>
                 <w:webHidden/>
               </w:rPr>
-              <w:instrText xml:space="preserve"> PAGEREF _Toc238733320 \h </w:instrText>
+              <w:instrText xml:space="preserve"> PAGEREF _Toc238736073 \h </w:instrText>
             </w:r>
             <w:r>
               <w:rPr>
@@ -2736,7 +2736,7 @@
               <w:rPr>
                 <w:webHidden/>
               </w:rPr>
-              <w:t>33</w:t>
+              <w:t>32</w:t>
             </w:r>
             <w:r>
               <w:rPr>
@@ -2761,7 +2761,7 @@
               <w14:ligatures w14:val="standardContextual"/>
             </w:rPr>
           </w:pPr>
-          <w:hyperlink w:anchor="_Toc238733321" w:history="1">
+          <w:hyperlink w:anchor="_Toc238736074" w:history="1">
             <w:r>
               <w:rPr>
                 <w:rStyle w:val="Hipervnculo"/>
@@ -2784,7 +2784,7 @@
               <w:rPr>
                 <w:webHidden/>
               </w:rPr>
-              <w:instrText xml:space="preserve"> PAGEREF _Toc238733321 \h </w:instrText>
+              <w:instrText xml:space="preserve"> PAGEREF _Toc238736074 \h </w:instrText>
             </w:r>
             <w:r>
               <w:rPr>
@@ -2801,7 +2801,7 @@
               <w:rPr>
                 <w:webHidden/>
               </w:rPr>
-              <w:t>34</w:t>
+              <w:t>33</w:t>
             </w:r>
             <w:r>
               <w:rPr>
@@ -2826,7 +2826,7 @@
               <w14:ligatures w14:val="standardContextual"/>
             </w:rPr>
           </w:pPr>
-          <w:hyperlink w:anchor="_Toc238733322" w:history="1">
+          <w:hyperlink w:anchor="_Toc238736075" w:history="1">
             <w:r>
               <w:rPr>
                 <w:rStyle w:val="Hipervnculo"/>
@@ -2849,7 +2849,7 @@
               <w:rPr>
                 <w:webHidden/>
               </w:rPr>
-              <w:instrText xml:space="preserve"> PAGEREF _Toc238733322 \h </w:instrText>
+              <w:instrText xml:space="preserve"> PAGEREF _Toc238736075 \h </w:instrText>
             </w:r>
             <w:r>
               <w:rPr>
@@ -2866,7 +2866,7 @@
               <w:rPr>
                 <w:webHidden/>
               </w:rPr>
-              <w:t>34</w:t>
+              <w:t>33</w:t>
             </w:r>
             <w:r>
               <w:rPr>
@@ -2891,7 +2891,7 @@
               <w14:ligatures w14:val="standardContextual"/>
             </w:rPr>
           </w:pPr>
-          <w:hyperlink w:anchor="_Toc238733323" w:history="1">
+          <w:hyperlink w:anchor="_Toc238736076" w:history="1">
             <w:r>
               <w:rPr>
                 <w:rStyle w:val="Hipervnculo"/>
@@ -2914,7 +2914,7 @@
               <w:rPr>
                 <w:webHidden/>
               </w:rPr>
-              <w:instrText xml:space="preserve"> PAGEREF _Toc238733323 \h </w:instrText>
+              <w:instrText xml:space="preserve"> PAGEREF _Toc238736076 \h </w:instrText>
             </w:r>
             <w:r>
               <w:rPr>
@@ -2931,7 +2931,7 @@
               <w:rPr>
                 <w:webHidden/>
               </w:rPr>
-              <w:t>35</w:t>
+              <w:t>34</w:t>
             </w:r>
             <w:r>
               <w:rPr>
@@ -2956,7 +2956,7 @@
               <w14:ligatures w14:val="standardContextual"/>
             </w:rPr>
           </w:pPr>
-          <w:hyperlink w:anchor="_Toc238733324" w:history="1">
+          <w:hyperlink w:anchor="_Toc238736077" w:history="1">
             <w:r>
               <w:rPr>
                 <w:rStyle w:val="Hipervnculo"/>
@@ -2979,7 +2979,7 @@
               <w:rPr>
                 <w:webHidden/>
               </w:rPr>
-              <w:instrText xml:space="preserve"> PAGEREF _Toc238733324 \h </w:instrText>
+              <w:instrText xml:space="preserve"> PAGEREF _Toc238736077 \h </w:instrText>
             </w:r>
             <w:r>
               <w:rPr>
@@ -2996,7 +2996,7 @@
               <w:rPr>
                 <w:webHidden/>
               </w:rPr>
-              <w:t>35</w:t>
+              <w:t>34</w:t>
             </w:r>
             <w:r>
               <w:rPr>
@@ -3021,7 +3021,7 @@
               <w14:ligatures w14:val="standardContextual"/>
             </w:rPr>
           </w:pPr>
-          <w:hyperlink w:anchor="_Toc238733325" w:history="1">
+          <w:hyperlink w:anchor="_Toc238736078" w:history="1">
             <w:r>
               <w:rPr>
                 <w:rStyle w:val="Hipervnculo"/>
@@ -3044,7 +3044,7 @@
               <w:rPr>
                 <w:webHidden/>
               </w:rPr>
-              <w:instrText xml:space="preserve"> PAGEREF _Toc238733325 \h </w:instrText>
+              <w:instrText xml:space="preserve"> PAGEREF _Toc238736078 \h </w:instrText>
             </w:r>
             <w:r>
               <w:rPr>
@@ -3061,7 +3061,7 @@
               <w:rPr>
                 <w:webHidden/>
               </w:rPr>
-              <w:t>35</w:t>
+              <w:t>34</w:t>
             </w:r>
             <w:r>
               <w:rPr>
@@ -3086,7 +3086,7 @@
               <w14:ligatures w14:val="standardContextual"/>
             </w:rPr>
           </w:pPr>
-          <w:hyperlink w:anchor="_Toc238733326" w:history="1">
+          <w:hyperlink w:anchor="_Toc238736079" w:history="1">
             <w:r>
               <w:rPr>
                 <w:rStyle w:val="Hipervnculo"/>
@@ -3109,7 +3109,7 @@
               <w:rPr>
                 <w:webHidden/>
               </w:rPr>
-              <w:instrText xml:space="preserve"> PAGEREF _Toc238733326 \h </w:instrText>
+              <w:instrText xml:space="preserve"> PAGEREF _Toc238736079 \h </w:instrText>
             </w:r>
             <w:r>
               <w:rPr>
@@ -3126,7 +3126,7 @@
               <w:rPr>
                 <w:webHidden/>
               </w:rPr>
-              <w:t>37</w:t>
+              <w:t>36</w:t>
             </w:r>
             <w:r>
               <w:rPr>
@@ -3151,7 +3151,7 @@
               <w14:ligatures w14:val="standardContextual"/>
             </w:rPr>
           </w:pPr>
-          <w:hyperlink w:anchor="_Toc238733327" w:history="1">
+          <w:hyperlink w:anchor="_Toc238736080" w:history="1">
             <w:r>
               <w:rPr>
                 <w:rStyle w:val="Hipervnculo"/>
@@ -3174,7 +3174,7 @@
               <w:rPr>
                 <w:webHidden/>
               </w:rPr>
-              <w:instrText xml:space="preserve"> PAGEREF _Toc238733327 \h </w:instrText>
+              <w:instrText xml:space="preserve"> PAGEREF _Toc238736080 \h </w:instrText>
             </w:r>
             <w:r>
               <w:rPr>
@@ -3191,7 +3191,7 @@
               <w:rPr>
                 <w:webHidden/>
               </w:rPr>
-              <w:t>39</w:t>
+              <w:t>38</w:t>
             </w:r>
             <w:r>
               <w:rPr>
@@ -3216,7 +3216,7 @@
               <w14:ligatures w14:val="standardContextual"/>
             </w:rPr>
           </w:pPr>
-          <w:hyperlink w:anchor="_Toc238733328" w:history="1">
+          <w:hyperlink w:anchor="_Toc238736081" w:history="1">
             <w:r>
               <w:rPr>
                 <w:rStyle w:val="Hipervnculo"/>
@@ -3239,7 +3239,7 @@
               <w:rPr>
                 <w:webHidden/>
               </w:rPr>
-              <w:instrText xml:space="preserve"> PAGEREF _Toc238733328 \h </w:instrText>
+              <w:instrText xml:space="preserve"> PAGEREF _Toc238736081 \h </w:instrText>
             </w:r>
             <w:r>
               <w:rPr>
@@ -3256,7 +3256,7 @@
               <w:rPr>
                 <w:webHidden/>
               </w:rPr>
-              <w:t>39</w:t>
+              <w:t>38</w:t>
             </w:r>
             <w:r>
               <w:rPr>
@@ -3281,7 +3281,7 @@
               <w14:ligatures w14:val="standardContextual"/>
             </w:rPr>
           </w:pPr>
-          <w:hyperlink w:anchor="_Toc238733329" w:history="1">
+          <w:hyperlink w:anchor="_Toc238736082" w:history="1">
             <w:r>
               <w:rPr>
                 <w:rStyle w:val="Hipervnculo"/>
@@ -3304,7 +3304,7 @@
               <w:rPr>
                 <w:webHidden/>
               </w:rPr>
-              <w:instrText xml:space="preserve"> PAGEREF _Toc238733329 \h </w:instrText>
+              <w:instrText xml:space="preserve"> PAGEREF _Toc238736082 \h </w:instrText>
             </w:r>
             <w:r>
               <w:rPr>
@@ -3321,7 +3321,7 @@
               <w:rPr>
                 <w:webHidden/>
               </w:rPr>
-              <w:t>41</w:t>
+              <w:t>40</w:t>
             </w:r>
             <w:r>
               <w:rPr>
@@ -3346,7 +3346,7 @@
               <w14:ligatures w14:val="standardContextual"/>
             </w:rPr>
           </w:pPr>
-          <w:hyperlink w:anchor="_Toc238733330" w:history="1">
+          <w:hyperlink w:anchor="_Toc238736083" w:history="1">
             <w:r>
               <w:rPr>
                 <w:rStyle w:val="Hipervnculo"/>
@@ -3369,7 +3369,7 @@
               <w:rPr>
                 <w:webHidden/>
               </w:rPr>
-              <w:instrText xml:space="preserve"> PAGEREF _Toc238733330 \h </w:instrText>
+              <w:instrText xml:space="preserve"> PAGEREF _Toc238736083 \h </w:instrText>
             </w:r>
             <w:r>
               <w:rPr>
@@ -3386,7 +3386,7 @@
               <w:rPr>
                 <w:webHidden/>
               </w:rPr>
-              <w:t>44</w:t>
+              <w:t>43</w:t>
             </w:r>
             <w:r>
               <w:rPr>
@@ -3411,7 +3411,7 @@
               <w14:ligatures w14:val="standardContextual"/>
             </w:rPr>
           </w:pPr>
-          <w:hyperlink w:anchor="_Toc238733331" w:history="1">
+          <w:hyperlink w:anchor="_Toc238736084" w:history="1">
             <w:r>
               <w:rPr>
                 <w:rStyle w:val="Hipervnculo"/>
@@ -3434,7 +3434,7 @@
               <w:rPr>
                 <w:webHidden/>
               </w:rPr>
-              <w:instrText xml:space="preserve"> PAGEREF _Toc238733331 \h </w:instrText>
+              <w:instrText xml:space="preserve"> PAGEREF _Toc238736084 \h </w:instrText>
             </w:r>
             <w:r>
               <w:rPr>
@@ -3451,7 +3451,7 @@
               <w:rPr>
                 <w:webHidden/>
               </w:rPr>
-              <w:t>47</w:t>
+              <w:t>46</w:t>
             </w:r>
             <w:r>
               <w:rPr>
@@ -3476,7 +3476,7 @@
               <w14:ligatures w14:val="standardContextual"/>
             </w:rPr>
           </w:pPr>
-          <w:hyperlink w:anchor="_Toc238733332" w:history="1">
+          <w:hyperlink w:anchor="_Toc238736085" w:history="1">
             <w:r>
               <w:rPr>
                 <w:rStyle w:val="Hipervnculo"/>
@@ -3499,7 +3499,7 @@
               <w:rPr>
                 <w:webHidden/>
               </w:rPr>
-              <w:instrText xml:space="preserve"> PAGEREF _Toc238733332 \h </w:instrText>
+              <w:instrText xml:space="preserve"> PAGEREF _Toc238736085 \h </w:instrText>
             </w:r>
             <w:r>
               <w:rPr>
@@ -3516,7 +3516,7 @@
               <w:rPr>
                 <w:webHidden/>
               </w:rPr>
-              <w:t>49</w:t>
+              <w:t>48</w:t>
             </w:r>
             <w:r>
               <w:rPr>
@@ -3541,7 +3541,7 @@
               <w14:ligatures w14:val="standardContextual"/>
             </w:rPr>
           </w:pPr>
-          <w:hyperlink w:anchor="_Toc238733333" w:history="1">
+          <w:hyperlink w:anchor="_Toc238736086" w:history="1">
             <w:r>
               <w:rPr>
                 <w:rStyle w:val="Hipervnculo"/>
@@ -3564,7 +3564,7 @@
               <w:rPr>
                 <w:webHidden/>
               </w:rPr>
-              <w:instrText xml:space="preserve"> PAGEREF _Toc238733333 \h </w:instrText>
+              <w:instrText xml:space="preserve"> PAGEREF _Toc238736086 \h </w:instrText>
             </w:r>
             <w:r>
               <w:rPr>
@@ -3581,7 +3581,7 @@
               <w:rPr>
                 <w:webHidden/>
               </w:rPr>
-              <w:t>50</w:t>
+              <w:t>49</w:t>
             </w:r>
             <w:r>
               <w:rPr>
@@ -3606,7 +3606,7 @@
               <w14:ligatures w14:val="standardContextual"/>
             </w:rPr>
           </w:pPr>
-          <w:hyperlink w:anchor="_Toc238733334" w:history="1">
+          <w:hyperlink w:anchor="_Toc238736087" w:history="1">
             <w:r>
               <w:rPr>
                 <w:rStyle w:val="Hipervnculo"/>
@@ -3629,7 +3629,7 @@
               <w:rPr>
                 <w:webHidden/>
               </w:rPr>
-              <w:instrText xml:space="preserve"> PAGEREF _Toc238733334 \h </w:instrText>
+              <w:instrText xml:space="preserve"> PAGEREF _Toc238736087 \h </w:instrText>
             </w:r>
             <w:r>
               <w:rPr>
@@ -3646,7 +3646,7 @@
               <w:rPr>
                 <w:webHidden/>
               </w:rPr>
-              <w:t>53</w:t>
+              <w:t>52</w:t>
             </w:r>
             <w:r>
               <w:rPr>
@@ -3671,7 +3671,7 @@
               <w14:ligatures w14:val="standardContextual"/>
             </w:rPr>
           </w:pPr>
-          <w:hyperlink w:anchor="_Toc238733335" w:history="1">
+          <w:hyperlink w:anchor="_Toc238736088" w:history="1">
             <w:r>
               <w:rPr>
                 <w:rStyle w:val="Hipervnculo"/>
@@ -3694,7 +3694,7 @@
               <w:rPr>
                 <w:webHidden/>
               </w:rPr>
-              <w:instrText xml:space="preserve"> PAGEREF _Toc238733335 \h </w:instrText>
+              <w:instrText xml:space="preserve"> PAGEREF _Toc238736088 \h </w:instrText>
             </w:r>
             <w:r>
               <w:rPr>
@@ -3711,7 +3711,7 @@
               <w:rPr>
                 <w:webHidden/>
               </w:rPr>
-              <w:t>57</w:t>
+              <w:t>56</w:t>
             </w:r>
             <w:r>
               <w:rPr>
@@ -3736,7 +3736,7 @@
               <w14:ligatures w14:val="standardContextual"/>
             </w:rPr>
           </w:pPr>
-          <w:hyperlink w:anchor="_Toc238733336" w:history="1">
+          <w:hyperlink w:anchor="_Toc238736089" w:history="1">
             <w:r>
               <w:rPr>
                 <w:rStyle w:val="Hipervnculo"/>
@@ -3759,7 +3759,7 @@
               <w:rPr>
                 <w:webHidden/>
               </w:rPr>
-              <w:instrText xml:space="preserve"> PAGEREF _Toc238733336 \h </w:instrText>
+              <w:instrText xml:space="preserve"> PAGEREF _Toc238736089 \h </w:instrText>
             </w:r>
             <w:r>
               <w:rPr>
@@ -3776,7 +3776,7 @@
               <w:rPr>
                 <w:webHidden/>
               </w:rPr>
-              <w:t>63</w:t>
+              <w:t>62</w:t>
             </w:r>
             <w:r>
               <w:rPr>
@@ -3801,7 +3801,7 @@
               <w14:ligatures w14:val="standardContextual"/>
             </w:rPr>
           </w:pPr>
-          <w:hyperlink w:anchor="_Toc238733337" w:history="1">
+          <w:hyperlink w:anchor="_Toc238736090" w:history="1">
             <w:r>
               <w:rPr>
                 <w:rStyle w:val="Hipervnculo"/>
@@ -3824,7 +3824,7 @@
               <w:rPr>
                 <w:webHidden/>
               </w:rPr>
-              <w:instrText xml:space="preserve"> PAGEREF _Toc238733337 \h </w:instrText>
+              <w:instrText xml:space="preserve"> PAGEREF _Toc238736090 \h </w:instrText>
             </w:r>
             <w:r>
               <w:rPr>
@@ -3841,7 +3841,7 @@
               <w:rPr>
                 <w:webHidden/>
               </w:rPr>
-              <w:t>63</w:t>
+              <w:t>62</w:t>
             </w:r>
             <w:r>
               <w:rPr>
@@ -3866,7 +3866,7 @@
               <w14:ligatures w14:val="standardContextual"/>
             </w:rPr>
           </w:pPr>
-          <w:hyperlink w:anchor="_Toc238733338" w:history="1">
+          <w:hyperlink w:anchor="_Toc238736091" w:history="1">
             <w:r>
               <w:rPr>
                 <w:rStyle w:val="Hipervnculo"/>
@@ -3889,7 +3889,7 @@
               <w:rPr>
                 <w:webHidden/>
               </w:rPr>
-              <w:instrText xml:space="preserve"> PAGEREF _Toc238733338 \h </w:instrText>
+              <w:instrText xml:space="preserve"> PAGEREF _Toc238736091 \h </w:instrText>
             </w:r>
             <w:r>
               <w:rPr>
@@ -3906,7 +3906,7 @@
               <w:rPr>
                 <w:webHidden/>
               </w:rPr>
-              <w:t>64</w:t>
+              <w:t>63</w:t>
             </w:r>
             <w:r>
               <w:rPr>
@@ -3931,7 +3931,7 @@
               <w14:ligatures w14:val="standardContextual"/>
             </w:rPr>
           </w:pPr>
-          <w:hyperlink w:anchor="_Toc238733339" w:history="1">
+          <w:hyperlink w:anchor="_Toc238736092" w:history="1">
             <w:r>
               <w:rPr>
                 <w:rStyle w:val="Hipervnculo"/>
@@ -3954,7 +3954,7 @@
               <w:rPr>
                 <w:webHidden/>
               </w:rPr>
-              <w:instrText xml:space="preserve"> PAGEREF _Toc238733339 \h </w:instrText>
+              <w:instrText xml:space="preserve"> PAGEREF _Toc238736092 \h </w:instrText>
             </w:r>
             <w:r>
               <w:rPr>
@@ -3971,7 +3971,7 @@
               <w:rPr>
                 <w:webHidden/>
               </w:rPr>
-              <w:t>64</w:t>
+              <w:t>63</w:t>
             </w:r>
             <w:r>
               <w:rPr>
@@ -3996,7 +3996,7 @@
               <w14:ligatures w14:val="standardContextual"/>
             </w:rPr>
           </w:pPr>
-          <w:hyperlink w:anchor="_Toc238733340" w:history="1">
+          <w:hyperlink w:anchor="_Toc238736093" w:history="1">
             <w:r>
               <w:rPr>
                 <w:rStyle w:val="Hipervnculo"/>
@@ -4019,7 +4019,7 @@
               <w:rPr>
                 <w:webHidden/>
               </w:rPr>
-              <w:instrText xml:space="preserve"> PAGEREF _Toc238733340 \h </w:instrText>
+              <w:instrText xml:space="preserve"> PAGEREF _Toc238736093 \h </w:instrText>
             </w:r>
             <w:r>
               <w:rPr>
@@ -4036,7 +4036,7 @@
               <w:rPr>
                 <w:webHidden/>
               </w:rPr>
-              <w:t>66</w:t>
+              <w:t>65</w:t>
             </w:r>
             <w:r>
               <w:rPr>
@@ -4061,7 +4061,7 @@
               <w14:ligatures w14:val="standardContextual"/>
             </w:rPr>
           </w:pPr>
-          <w:hyperlink w:anchor="_Toc238733341" w:history="1">
+          <w:hyperlink w:anchor="_Toc238736094" w:history="1">
             <w:r>
               <w:rPr>
                 <w:rStyle w:val="Hipervnculo"/>
@@ -4084,7 +4084,7 @@
               <w:rPr>
                 <w:webHidden/>
               </w:rPr>
-              <w:instrText xml:space="preserve"> PAGEREF _Toc238733341 \h </w:instrText>
+              <w:instrText xml:space="preserve"> PAGEREF _Toc238736094 \h </w:instrText>
             </w:r>
             <w:r>
               <w:rPr>
@@ -4101,7 +4101,7 @@
               <w:rPr>
                 <w:webHidden/>
               </w:rPr>
-              <w:t>66</w:t>
+              <w:t>65</w:t>
             </w:r>
             <w:r>
               <w:rPr>
@@ -4126,7 +4126,7 @@
               <w14:ligatures w14:val="standardContextual"/>
             </w:rPr>
           </w:pPr>
-          <w:hyperlink w:anchor="_Toc238733342" w:history="1">
+          <w:hyperlink w:anchor="_Toc238736095" w:history="1">
             <w:r>
               <w:rPr>
                 <w:rStyle w:val="Hipervnculo"/>
@@ -4149,7 +4149,7 @@
               <w:rPr>
                 <w:webHidden/>
               </w:rPr>
-              <w:instrText xml:space="preserve"> PAGEREF _Toc238733342 \h </w:instrText>
+              <w:instrText xml:space="preserve"> PAGEREF _Toc238736095 \h </w:instrText>
             </w:r>
             <w:r>
               <w:rPr>
@@ -4166,7 +4166,7 @@
               <w:rPr>
                 <w:webHidden/>
               </w:rPr>
-              <w:t>66</w:t>
+              <w:t>65</w:t>
             </w:r>
             <w:r>
               <w:rPr>
@@ -4191,7 +4191,7 @@
               <w14:ligatures w14:val="standardContextual"/>
             </w:rPr>
           </w:pPr>
-          <w:hyperlink w:anchor="_Toc238733343" w:history="1">
+          <w:hyperlink w:anchor="_Toc238736096" w:history="1">
             <w:r>
               <w:rPr>
                 <w:rStyle w:val="Hipervnculo"/>
@@ -4214,7 +4214,7 @@
               <w:rPr>
                 <w:webHidden/>
               </w:rPr>
-              <w:instrText xml:space="preserve"> PAGEREF _Toc238733343 \h </w:instrText>
+              <w:instrText xml:space="preserve"> PAGEREF _Toc238736096 \h </w:instrText>
             </w:r>
             <w:r>
               <w:rPr>
@@ -4231,7 +4231,7 @@
               <w:rPr>
                 <w:webHidden/>
               </w:rPr>
-              <w:t>67</w:t>
+              <w:t>66</w:t>
             </w:r>
             <w:r>
               <w:rPr>
@@ -4256,7 +4256,7 @@
               <w14:ligatures w14:val="standardContextual"/>
             </w:rPr>
           </w:pPr>
-          <w:hyperlink w:anchor="_Toc238733344" w:history="1">
+          <w:hyperlink w:anchor="_Toc238736097" w:history="1">
             <w:r>
               <w:rPr>
                 <w:rStyle w:val="Hipervnculo"/>
@@ -4279,7 +4279,7 @@
               <w:rPr>
                 <w:webHidden/>
               </w:rPr>
-              <w:instrText xml:space="preserve"> PAGEREF _Toc238733344 \h </w:instrText>
+              <w:instrText xml:space="preserve"> PAGEREF _Toc238736097 \h </w:instrText>
             </w:r>
             <w:r>
               <w:rPr>
@@ -4296,7 +4296,7 @@
               <w:rPr>
                 <w:webHidden/>
               </w:rPr>
-              <w:t>67</w:t>
+              <w:t>66</w:t>
             </w:r>
             <w:r>
               <w:rPr>
@@ -4321,7 +4321,7 @@
               <w14:ligatures w14:val="standardContextual"/>
             </w:rPr>
           </w:pPr>
-          <w:hyperlink w:anchor="_Toc238733345" w:history="1">
+          <w:hyperlink w:anchor="_Toc238736098" w:history="1">
             <w:r>
               <w:rPr>
                 <w:rStyle w:val="Hipervnculo"/>
@@ -4344,7 +4344,7 @@
               <w:rPr>
                 <w:webHidden/>
               </w:rPr>
-              <w:instrText xml:space="preserve"> PAGEREF _Toc238733345 \h </w:instrText>
+              <w:instrText xml:space="preserve"> PAGEREF _Toc238736098 \h </w:instrText>
             </w:r>
             <w:r>
               <w:rPr>
@@ -4361,7 +4361,7 @@
               <w:rPr>
                 <w:webHidden/>
               </w:rPr>
-              <w:t>68</w:t>
+              <w:t>67</w:t>
             </w:r>
             <w:r>
               <w:rPr>
@@ -4386,7 +4386,7 @@
               <w14:ligatures w14:val="standardContextual"/>
             </w:rPr>
           </w:pPr>
-          <w:hyperlink w:anchor="_Toc238733346" w:history="1">
+          <w:hyperlink w:anchor="_Toc238736099" w:history="1">
             <w:r>
               <w:rPr>
                 <w:rStyle w:val="Hipervnculo"/>
@@ -4409,7 +4409,7 @@
               <w:rPr>
                 <w:webHidden/>
               </w:rPr>
-              <w:instrText xml:space="preserve"> PAGEREF _Toc238733346 \h </w:instrText>
+              <w:instrText xml:space="preserve"> PAGEREF _Toc238736099 \h </w:instrText>
             </w:r>
             <w:r>
               <w:rPr>
@@ -4426,7 +4426,7 @@
               <w:rPr>
                 <w:webHidden/>
               </w:rPr>
-              <w:t>69</w:t>
+              <w:t>68</w:t>
             </w:r>
             <w:r>
               <w:rPr>
@@ -4451,7 +4451,7 @@
               <w14:ligatures w14:val="standardContextual"/>
             </w:rPr>
           </w:pPr>
-          <w:hyperlink w:anchor="_Toc238733347" w:history="1">
+          <w:hyperlink w:anchor="_Toc238736100" w:history="1">
             <w:r>
               <w:rPr>
                 <w:rStyle w:val="Hipervnculo"/>
@@ -4474,7 +4474,7 @@
               <w:rPr>
                 <w:webHidden/>
               </w:rPr>
-              <w:instrText xml:space="preserve"> PAGEREF _Toc238733347 \h </w:instrText>
+              <w:instrText xml:space="preserve"> PAGEREF _Toc238736100 \h </w:instrText>
             </w:r>
             <w:r>
               <w:rPr>
@@ -4491,7 +4491,7 @@
               <w:rPr>
                 <w:webHidden/>
               </w:rPr>
-              <w:t>69</w:t>
+              <w:t>68</w:t>
             </w:r>
             <w:r>
               <w:rPr>
@@ -4516,7 +4516,7 @@
               <w14:ligatures w14:val="standardContextual"/>
             </w:rPr>
           </w:pPr>
-          <w:hyperlink w:anchor="_Toc238733348" w:history="1">
+          <w:hyperlink w:anchor="_Toc238736101" w:history="1">
             <w:r>
               <w:rPr>
                 <w:rStyle w:val="Hipervnculo"/>
@@ -4539,7 +4539,7 @@
               <w:rPr>
                 <w:webHidden/>
               </w:rPr>
-              <w:instrText xml:space="preserve"> PAGEREF _Toc238733348 \h </w:instrText>
+              <w:instrText xml:space="preserve"> PAGEREF _Toc238736101 \h </w:instrText>
             </w:r>
             <w:r>
               <w:rPr>
@@ -4556,7 +4556,7 @@
               <w:rPr>
                 <w:webHidden/>
               </w:rPr>
-              <w:t>71</w:t>
+              <w:t>70</w:t>
             </w:r>
             <w:r>
               <w:rPr>
@@ -4581,7 +4581,7 @@
               <w14:ligatures w14:val="standardContextual"/>
             </w:rPr>
           </w:pPr>
-          <w:hyperlink w:anchor="_Toc238733349" w:history="1">
+          <w:hyperlink w:anchor="_Toc238736102" w:history="1">
             <w:r>
               <w:rPr>
                 <w:rStyle w:val="Hipervnculo"/>
@@ -4604,7 +4604,7 @@
               <w:rPr>
                 <w:webHidden/>
               </w:rPr>
-              <w:instrText xml:space="preserve"> PAGEREF _Toc238733349 \h </w:instrText>
+              <w:instrText xml:space="preserve"> PAGEREF _Toc238736102 \h </w:instrText>
             </w:r>
             <w:r>
               <w:rPr>
@@ -4621,7 +4621,7 @@
               <w:rPr>
                 <w:webHidden/>
               </w:rPr>
-              <w:t>71</w:t>
+              <w:t>70</w:t>
             </w:r>
             <w:r>
               <w:rPr>
@@ -4646,7 +4646,7 @@
               <w14:ligatures w14:val="standardContextual"/>
             </w:rPr>
           </w:pPr>
-          <w:hyperlink w:anchor="_Toc238733350" w:history="1">
+          <w:hyperlink w:anchor="_Toc238736103" w:history="1">
             <w:r>
               <w:rPr>
                 <w:rStyle w:val="Hipervnculo"/>
@@ -4669,7 +4669,7 @@
               <w:rPr>
                 <w:webHidden/>
               </w:rPr>
-              <w:instrText xml:space="preserve"> PAGEREF _Toc238733350 \h </w:instrText>
+              <w:instrText xml:space="preserve"> PAGEREF _Toc238736103 \h </w:instrText>
             </w:r>
             <w:r>
               <w:rPr>
@@ -4686,7 +4686,7 @@
               <w:rPr>
                 <w:webHidden/>
               </w:rPr>
-              <w:t>72</w:t>
+              <w:t>71</w:t>
             </w:r>
             <w:r>
               <w:rPr>
@@ -4711,7 +4711,7 @@
               <w14:ligatures w14:val="standardContextual"/>
             </w:rPr>
           </w:pPr>
-          <w:hyperlink w:anchor="_Toc238733351" w:history="1">
+          <w:hyperlink w:anchor="_Toc238736104" w:history="1">
             <w:r>
               <w:rPr>
                 <w:rStyle w:val="Hipervnculo"/>
@@ -4734,7 +4734,7 @@
               <w:rPr>
                 <w:webHidden/>
               </w:rPr>
-              <w:instrText xml:space="preserve"> PAGEREF _Toc238733351 \h </w:instrText>
+              <w:instrText xml:space="preserve"> PAGEREF _Toc238736104 \h </w:instrText>
             </w:r>
             <w:r>
               <w:rPr>
@@ -4751,7 +4751,7 @@
               <w:rPr>
                 <w:webHidden/>
               </w:rPr>
-              <w:t>73</w:t>
+              <w:t>72</w:t>
             </w:r>
             <w:r>
               <w:rPr>
@@ -4776,7 +4776,7 @@
               <w14:ligatures w14:val="standardContextual"/>
             </w:rPr>
           </w:pPr>
-          <w:hyperlink w:anchor="_Toc238733352" w:history="1">
+          <w:hyperlink w:anchor="_Toc238736105" w:history="1">
             <w:r>
               <w:rPr>
                 <w:rStyle w:val="Hipervnculo"/>
@@ -4799,7 +4799,7 @@
               <w:rPr>
                 <w:webHidden/>
               </w:rPr>
-              <w:instrText xml:space="preserve"> PAGEREF _Toc238733352 \h </w:instrText>
+              <w:instrText xml:space="preserve"> PAGEREF _Toc238736105 \h </w:instrText>
             </w:r>
             <w:r>
               <w:rPr>
@@ -4816,7 +4816,7 @@
               <w:rPr>
                 <w:webHidden/>
               </w:rPr>
-              <w:t>73</w:t>
+              <w:t>72</w:t>
             </w:r>
             <w:r>
               <w:rPr>
@@ -4841,7 +4841,7 @@
               <w14:ligatures w14:val="standardContextual"/>
             </w:rPr>
           </w:pPr>
-          <w:hyperlink w:anchor="_Toc238733353" w:history="1">
+          <w:hyperlink w:anchor="_Toc238736106" w:history="1">
             <w:r>
               <w:rPr>
                 <w:rStyle w:val="Hipervnculo"/>
@@ -4864,7 +4864,7 @@
               <w:rPr>
                 <w:webHidden/>
               </w:rPr>
-              <w:instrText xml:space="preserve"> PAGEREF _Toc238733353 \h </w:instrText>
+              <w:instrText xml:space="preserve"> PAGEREF _Toc238736106 \h </w:instrText>
             </w:r>
             <w:r>
               <w:rPr>
@@ -4881,7 +4881,7 @@
               <w:rPr>
                 <w:webHidden/>
               </w:rPr>
-              <w:t>73</w:t>
+              <w:t>72</w:t>
             </w:r>
             <w:r>
               <w:rPr>
@@ -4906,7 +4906,7 @@
               <w14:ligatures w14:val="standardContextual"/>
             </w:rPr>
           </w:pPr>
-          <w:hyperlink w:anchor="_Toc238733354" w:history="1">
+          <w:hyperlink w:anchor="_Toc238736107" w:history="1">
             <w:r>
               <w:rPr>
                 <w:rStyle w:val="Hipervnculo"/>
@@ -4929,7 +4929,7 @@
               <w:rPr>
                 <w:webHidden/>
               </w:rPr>
-              <w:instrText xml:space="preserve"> PAGEREF _Toc238733354 \h </w:instrText>
+              <w:instrText xml:space="preserve"> PAGEREF _Toc238736107 \h </w:instrText>
             </w:r>
             <w:r>
               <w:rPr>
@@ -4946,7 +4946,7 @@
               <w:rPr>
                 <w:webHidden/>
               </w:rPr>
-              <w:t>75</w:t>
+              <w:t>74</w:t>
             </w:r>
             <w:r>
               <w:rPr>
@@ -4971,7 +4971,7 @@
               <w14:ligatures w14:val="standardContextual"/>
             </w:rPr>
           </w:pPr>
-          <w:hyperlink w:anchor="_Toc238733355" w:history="1">
+          <w:hyperlink w:anchor="_Toc238736108" w:history="1">
             <w:r>
               <w:rPr>
                 <w:rStyle w:val="Hipervnculo"/>
@@ -4994,7 +4994,7 @@
               <w:rPr>
                 <w:webHidden/>
               </w:rPr>
-              <w:instrText xml:space="preserve"> PAGEREF _Toc238733355 \h </w:instrText>
+              <w:instrText xml:space="preserve"> PAGEREF _Toc238736108 \h </w:instrText>
             </w:r>
             <w:r>
               <w:rPr>
@@ -5011,7 +5011,7 @@
               <w:rPr>
                 <w:webHidden/>
               </w:rPr>
-              <w:t>75</w:t>
+              <w:t>74</w:t>
             </w:r>
             <w:r>
               <w:rPr>
@@ -5036,7 +5036,7 @@
               <w14:ligatures w14:val="standardContextual"/>
             </w:rPr>
           </w:pPr>
-          <w:hyperlink w:anchor="_Toc238733356" w:history="1">
+          <w:hyperlink w:anchor="_Toc238736109" w:history="1">
             <w:r>
               <w:rPr>
                 <w:rStyle w:val="Hipervnculo"/>
@@ -5059,7 +5059,7 @@
               <w:rPr>
                 <w:webHidden/>
               </w:rPr>
-              <w:instrText xml:space="preserve"> PAGEREF _Toc238733356 \h </w:instrText>
+              <w:instrText xml:space="preserve"> PAGEREF _Toc238736109 \h </w:instrText>
             </w:r>
             <w:r>
               <w:rPr>
@@ -5076,7 +5076,7 @@
               <w:rPr>
                 <w:webHidden/>
               </w:rPr>
-              <w:t>75</w:t>
+              <w:t>74</w:t>
             </w:r>
             <w:r>
               <w:rPr>
@@ -5101,7 +5101,7 @@
               <w14:ligatures w14:val="standardContextual"/>
             </w:rPr>
           </w:pPr>
-          <w:hyperlink w:anchor="_Toc238733357" w:history="1">
+          <w:hyperlink w:anchor="_Toc238736110" w:history="1">
             <w:r>
               <w:rPr>
                 <w:rStyle w:val="Hipervnculo"/>
@@ -5124,7 +5124,7 @@
               <w:rPr>
                 <w:webHidden/>
               </w:rPr>
-              <w:instrText xml:space="preserve"> PAGEREF _Toc238733357 \h </w:instrText>
+              <w:instrText xml:space="preserve"> PAGEREF _Toc238736110 \h </w:instrText>
             </w:r>
             <w:r>
               <w:rPr>
@@ -5141,7 +5141,7 @@
               <w:rPr>
                 <w:webHidden/>
               </w:rPr>
-              <w:t>76</w:t>
+              <w:t>75</w:t>
             </w:r>
             <w:r>
               <w:rPr>
@@ -5166,7 +5166,7 @@
               <w14:ligatures w14:val="standardContextual"/>
             </w:rPr>
           </w:pPr>
-          <w:hyperlink w:anchor="_Toc238733358" w:history="1">
+          <w:hyperlink w:anchor="_Toc238736111" w:history="1">
             <w:r>
               <w:rPr>
                 <w:rStyle w:val="Hipervnculo"/>
@@ -5189,7 +5189,7 @@
               <w:rPr>
                 <w:webHidden/>
               </w:rPr>
-              <w:instrText xml:space="preserve"> PAGEREF _Toc238733358 \h </w:instrText>
+              <w:instrText xml:space="preserve"> PAGEREF _Toc238736111 \h </w:instrText>
             </w:r>
             <w:r>
               <w:rPr>
@@ -5206,7 +5206,7 @@
               <w:rPr>
                 <w:webHidden/>
               </w:rPr>
-              <w:t>78</w:t>
+              <w:t>77</w:t>
             </w:r>
             <w:r>
               <w:rPr>
@@ -5231,7 +5231,7 @@
               <w14:ligatures w14:val="standardContextual"/>
             </w:rPr>
           </w:pPr>
-          <w:hyperlink w:anchor="_Toc238733359" w:history="1">
+          <w:hyperlink w:anchor="_Toc238736112" w:history="1">
             <w:r>
               <w:rPr>
                 <w:rStyle w:val="Hipervnculo"/>
@@ -5254,7 +5254,7 @@
               <w:rPr>
                 <w:webHidden/>
               </w:rPr>
-              <w:instrText xml:space="preserve"> PAGEREF _Toc238733359 \h </w:instrText>
+              <w:instrText xml:space="preserve"> PAGEREF _Toc238736112 \h </w:instrText>
             </w:r>
             <w:r>
               <w:rPr>
@@ -5271,7 +5271,7 @@
               <w:rPr>
                 <w:webHidden/>
               </w:rPr>
-              <w:t>82</w:t>
+              <w:t>81</w:t>
             </w:r>
             <w:r>
               <w:rPr>
@@ -5296,7 +5296,7 @@
               <w14:ligatures w14:val="standardContextual"/>
             </w:rPr>
           </w:pPr>
-          <w:hyperlink w:anchor="_Toc238733360" w:history="1">
+          <w:hyperlink w:anchor="_Toc238736113" w:history="1">
             <w:r>
               <w:rPr>
                 <w:rStyle w:val="Hipervnculo"/>
@@ -5319,7 +5319,7 @@
               <w:rPr>
                 <w:webHidden/>
               </w:rPr>
-              <w:instrText xml:space="preserve"> PAGEREF _Toc238733360 \h </w:instrText>
+              <w:instrText xml:space="preserve"> PAGEREF _Toc238736113 \h </w:instrText>
             </w:r>
             <w:r>
               <w:rPr>
@@ -5336,7 +5336,7 @@
               <w:rPr>
                 <w:webHidden/>
               </w:rPr>
-              <w:t>82</w:t>
+              <w:t>81</w:t>
             </w:r>
             <w:r>
               <w:rPr>
@@ -5361,7 +5361,7 @@
               <w14:ligatures w14:val="standardContextual"/>
             </w:rPr>
           </w:pPr>
-          <w:hyperlink w:anchor="_Toc238733361" w:history="1">
+          <w:hyperlink w:anchor="_Toc238736114" w:history="1">
             <w:r>
               <w:rPr>
                 <w:rStyle w:val="Hipervnculo"/>
@@ -5384,7 +5384,7 @@
               <w:rPr>
                 <w:webHidden/>
               </w:rPr>
-              <w:instrText xml:space="preserve"> PAGEREF _Toc238733361 \h </w:instrText>
+              <w:instrText xml:space="preserve"> PAGEREF _Toc238736114 \h </w:instrText>
             </w:r>
             <w:r>
               <w:rPr>
@@ -5401,7 +5401,7 @@
               <w:rPr>
                 <w:webHidden/>
               </w:rPr>
-              <w:t>82</w:t>
+              <w:t>81</w:t>
             </w:r>
             <w:r>
               <w:rPr>
@@ -5426,7 +5426,7 @@
               <w14:ligatures w14:val="standardContextual"/>
             </w:rPr>
           </w:pPr>
-          <w:hyperlink w:anchor="_Toc238733362" w:history="1">
+          <w:hyperlink w:anchor="_Toc238736115" w:history="1">
             <w:r>
               <w:rPr>
                 <w:rStyle w:val="Hipervnculo"/>
@@ -5449,7 +5449,7 @@
               <w:rPr>
                 <w:webHidden/>
               </w:rPr>
-              <w:instrText xml:space="preserve"> PAGEREF _Toc238733362 \h </w:instrText>
+              <w:instrText xml:space="preserve"> PAGEREF _Toc238736115 \h </w:instrText>
             </w:r>
             <w:r>
               <w:rPr>
@@ -5466,7 +5466,7 @@
               <w:rPr>
                 <w:webHidden/>
               </w:rPr>
-              <w:t>82</w:t>
+              <w:t>81</w:t>
             </w:r>
             <w:r>
               <w:rPr>
@@ -5491,7 +5491,7 @@
               <w14:ligatures w14:val="standardContextual"/>
             </w:rPr>
           </w:pPr>
-          <w:hyperlink w:anchor="_Toc238733363" w:history="1">
+          <w:hyperlink w:anchor="_Toc238736116" w:history="1">
             <w:r>
               <w:rPr>
                 <w:rStyle w:val="Hipervnculo"/>
@@ -5514,7 +5514,7 @@
               <w:rPr>
                 <w:webHidden/>
               </w:rPr>
-              <w:instrText xml:space="preserve"> PAGEREF _Toc238733363 \h </w:instrText>
+              <w:instrText xml:space="preserve"> PAGEREF _Toc238736116 \h </w:instrText>
             </w:r>
             <w:r>
               <w:rPr>
@@ -5531,7 +5531,7 @@
               <w:rPr>
                 <w:webHidden/>
               </w:rPr>
-              <w:t>82</w:t>
+              <w:t>81</w:t>
             </w:r>
             <w:r>
               <w:rPr>
@@ -5556,7 +5556,7 @@
               <w14:ligatures w14:val="standardContextual"/>
             </w:rPr>
           </w:pPr>
-          <w:hyperlink w:anchor="_Toc238733364" w:history="1">
+          <w:hyperlink w:anchor="_Toc238736117" w:history="1">
             <w:r>
               <w:rPr>
                 <w:rStyle w:val="Hipervnculo"/>
@@ -5579,7 +5579,7 @@
               <w:rPr>
                 <w:webHidden/>
               </w:rPr>
-              <w:instrText xml:space="preserve"> PAGEREF _Toc238733364 \h </w:instrText>
+              <w:instrText xml:space="preserve"> PAGEREF _Toc238736117 \h </w:instrText>
             </w:r>
             <w:r>
               <w:rPr>
@@ -5596,7 +5596,7 @@
               <w:rPr>
                 <w:webHidden/>
               </w:rPr>
-              <w:t>83</w:t>
+              <w:t>82</w:t>
             </w:r>
             <w:r>
               <w:rPr>
@@ -5621,7 +5621,7 @@
               <w14:ligatures w14:val="standardContextual"/>
             </w:rPr>
           </w:pPr>
-          <w:hyperlink w:anchor="_Toc238733365" w:history="1">
+          <w:hyperlink w:anchor="_Toc238736118" w:history="1">
             <w:r>
               <w:rPr>
                 <w:rStyle w:val="Hipervnculo"/>
@@ -5644,7 +5644,7 @@
               <w:rPr>
                 <w:webHidden/>
               </w:rPr>
-              <w:instrText xml:space="preserve"> PAGEREF _Toc238733365 \h </w:instrText>
+              <w:instrText xml:space="preserve"> PAGEREF _Toc238736118 \h </w:instrText>
             </w:r>
             <w:r>
               <w:rPr>
@@ -5661,7 +5661,7 @@
               <w:rPr>
                 <w:webHidden/>
               </w:rPr>
-              <w:t>84</w:t>
+              <w:t>83</w:t>
             </w:r>
             <w:r>
               <w:rPr>
@@ -5686,7 +5686,7 @@
               <w14:ligatures w14:val="standardContextual"/>
             </w:rPr>
           </w:pPr>
-          <w:hyperlink w:anchor="_Toc238733366" w:history="1">
+          <w:hyperlink w:anchor="_Toc238736119" w:history="1">
             <w:r>
               <w:rPr>
                 <w:rStyle w:val="Hipervnculo"/>
@@ -5709,7 +5709,7 @@
               <w:rPr>
                 <w:webHidden/>
               </w:rPr>
-              <w:instrText xml:space="preserve"> PAGEREF _Toc238733366 \h </w:instrText>
+              <w:instrText xml:space="preserve"> PAGEREF _Toc238736119 \h </w:instrText>
             </w:r>
             <w:r>
               <w:rPr>
@@ -5726,7 +5726,7 @@
               <w:rPr>
                 <w:webHidden/>
               </w:rPr>
-              <w:t>84</w:t>
+              <w:t>83</w:t>
             </w:r>
             <w:r>
               <w:rPr>
@@ -5751,7 +5751,7 @@
               <w14:ligatures w14:val="standardContextual"/>
             </w:rPr>
           </w:pPr>
-          <w:hyperlink w:anchor="_Toc238733367" w:history="1">
+          <w:hyperlink w:anchor="_Toc238736120" w:history="1">
             <w:r>
               <w:rPr>
                 <w:rStyle w:val="Hipervnculo"/>
@@ -5774,7 +5774,7 @@
               <w:rPr>
                 <w:webHidden/>
               </w:rPr>
-              <w:instrText xml:space="preserve"> PAGEREF _Toc238733367 \h </w:instrText>
+              <w:instrText xml:space="preserve"> PAGEREF _Toc238736120 \h </w:instrText>
             </w:r>
             <w:r>
               <w:rPr>
@@ -5791,7 +5791,7 @@
               <w:rPr>
                 <w:webHidden/>
               </w:rPr>
-              <w:t>84</w:t>
+              <w:t>83</w:t>
             </w:r>
             <w:r>
               <w:rPr>
@@ -5816,7 +5816,7 @@
               <w14:ligatures w14:val="standardContextual"/>
             </w:rPr>
           </w:pPr>
-          <w:hyperlink w:anchor="_Toc238733368" w:history="1">
+          <w:hyperlink w:anchor="_Toc238736121" w:history="1">
             <w:r>
               <w:rPr>
                 <w:rStyle w:val="Hipervnculo"/>
@@ -5839,7 +5839,7 @@
               <w:rPr>
                 <w:webHidden/>
               </w:rPr>
-              <w:instrText xml:space="preserve"> PAGEREF _Toc238733368 \h </w:instrText>
+              <w:instrText xml:space="preserve"> PAGEREF _Toc238736121 \h </w:instrText>
             </w:r>
             <w:r>
               <w:rPr>
@@ -5856,7 +5856,7 @@
               <w:rPr>
                 <w:webHidden/>
               </w:rPr>
-              <w:t>85</w:t>
+              <w:t>84</w:t>
             </w:r>
             <w:r>
               <w:rPr>
@@ -5881,7 +5881,7 @@
               <w14:ligatures w14:val="standardContextual"/>
             </w:rPr>
           </w:pPr>
-          <w:hyperlink w:anchor="_Toc238733369" w:history="1">
+          <w:hyperlink w:anchor="_Toc238736122" w:history="1">
             <w:r>
               <w:rPr>
                 <w:rStyle w:val="Hipervnculo"/>
@@ -5904,7 +5904,7 @@
               <w:rPr>
                 <w:webHidden/>
               </w:rPr>
-              <w:instrText xml:space="preserve"> PAGEREF _Toc238733369 \h </w:instrText>
+              <w:instrText xml:space="preserve"> PAGEREF _Toc238736122 \h </w:instrText>
             </w:r>
             <w:r>
               <w:rPr>
@@ -5921,7 +5921,7 @@
               <w:rPr>
                 <w:webHidden/>
               </w:rPr>
-              <w:t>89</w:t>
+              <w:t>88</w:t>
             </w:r>
             <w:r>
               <w:rPr>
@@ -5946,12 +5946,12 @@
               <w14:ligatures w14:val="standardContextual"/>
             </w:rPr>
           </w:pPr>
-          <w:hyperlink w:anchor="_Toc238733370" w:history="1">
+          <w:hyperlink w:anchor="_Toc238736123" w:history="1">
             <w:r>
               <w:rPr>
                 <w:rStyle w:val="Hipervnculo"/>
               </w:rPr>
-              <w:t>Apéndice C: Reproducibilidad y código</w:t>
+              <w:t>Apéndice C: Precedentes técnicos ampliados</w:t>
             </w:r>
             <w:r>
               <w:rPr>
@@ -5969,7 +5969,7 @@
               <w:rPr>
                 <w:webHidden/>
               </w:rPr>
-              <w:instrText xml:space="preserve"> PAGEREF _Toc238733370 \h </w:instrText>
+              <w:instrText xml:space="preserve"> PAGEREF _Toc238736123 \h </w:instrText>
             </w:r>
             <w:r>
               <w:rPr>
@@ -5986,7 +5986,7 @@
               <w:rPr>
                 <w:webHidden/>
               </w:rPr>
-              <w:t>92</w:t>
+              <w:t>91</w:t>
             </w:r>
             <w:r>
               <w:rPr>
@@ -6011,12 +6011,12 @@
               <w14:ligatures w14:val="standardContextual"/>
             </w:rPr>
           </w:pPr>
-          <w:hyperlink w:anchor="_Toc238733371" w:history="1">
+          <w:hyperlink w:anchor="_Toc238736124" w:history="1">
             <w:r>
               <w:rPr>
                 <w:rStyle w:val="Hipervnculo"/>
               </w:rPr>
-              <w:t>C.1. Mapa entre secciones de la memoria y módulos del notebook</w:t>
+              <w:t>C.1. Predicción computacional de la evolución viral</w:t>
             </w:r>
             <w:r>
               <w:rPr>
@@ -6034,7 +6034,7 @@
               <w:rPr>
                 <w:webHidden/>
               </w:rPr>
-              <w:instrText xml:space="preserve"> PAGEREF _Toc238733371 \h </w:instrText>
+              <w:instrText xml:space="preserve"> PAGEREF _Toc238736124 \h </w:instrText>
             </w:r>
             <w:r>
               <w:rPr>
@@ -6051,7 +6051,267 @@
               <w:rPr>
                 <w:webHidden/>
               </w:rPr>
+              <w:t>91</w:t>
+            </w:r>
+            <w:r>
+              <w:rPr>
+                <w:webHidden/>
+              </w:rPr>
+              <w:fldChar w:fldCharType="end"/>
+            </w:r>
+          </w:hyperlink>
+        </w:p>
+        <w:p>
+          <w:pPr>
+            <w:pStyle w:val="TDC2"/>
+            <w:tabs>
+              <w:tab w:val="right" w:leader="dot" w:pos="9112"/>
+            </w:tabs>
+            <w:rPr>
+              <w:rFonts w:asciiTheme="minorHAnsi" w:hAnsiTheme="minorHAnsi"/>
+              <w:kern w:val="2"/>
+              <w:sz w:val="24"/>
+              <w:szCs w:val="24"/>
+              <w:lang w:eastAsia="es-ES"/>
+              <w14:ligatures w14:val="standardContextual"/>
+            </w:rPr>
+          </w:pPr>
+          <w:hyperlink w:anchor="_Toc238736125" w:history="1">
+            <w:r>
+              <w:rPr>
+                <w:rStyle w:val="Hipervnculo"/>
+              </w:rPr>
+              <w:t>C.2. Gradient boosting en genómica</w:t>
+            </w:r>
+            <w:r>
+              <w:rPr>
+                <w:webHidden/>
+              </w:rPr>
+              <w:tab/>
+            </w:r>
+            <w:r>
+              <w:rPr>
+                <w:webHidden/>
+              </w:rPr>
+              <w:fldChar w:fldCharType="begin"/>
+            </w:r>
+            <w:r>
+              <w:rPr>
+                <w:webHidden/>
+              </w:rPr>
+              <w:instrText xml:space="preserve"> PAGEREF _Toc238736125 \h </w:instrText>
+            </w:r>
+            <w:r>
+              <w:rPr>
+                <w:webHidden/>
+              </w:rPr>
+            </w:r>
+            <w:r>
+              <w:rPr>
+                <w:webHidden/>
+              </w:rPr>
+              <w:fldChar w:fldCharType="separate"/>
+            </w:r>
+            <w:r>
+              <w:rPr>
+                <w:webHidden/>
+              </w:rPr>
+              <w:t>91</w:t>
+            </w:r>
+            <w:r>
+              <w:rPr>
+                <w:webHidden/>
+              </w:rPr>
+              <w:fldChar w:fldCharType="end"/>
+            </w:r>
+          </w:hyperlink>
+        </w:p>
+        <w:p>
+          <w:pPr>
+            <w:pStyle w:val="TDC2"/>
+            <w:tabs>
+              <w:tab w:val="right" w:leader="dot" w:pos="9112"/>
+            </w:tabs>
+            <w:rPr>
+              <w:rFonts w:asciiTheme="minorHAnsi" w:hAnsiTheme="minorHAnsi"/>
+              <w:kern w:val="2"/>
+              <w:sz w:val="24"/>
+              <w:szCs w:val="24"/>
+              <w:lang w:eastAsia="es-ES"/>
+              <w14:ligatures w14:val="standardContextual"/>
+            </w:rPr>
+          </w:pPr>
+          <w:hyperlink w:anchor="_Toc238736126" w:history="1">
+            <w:r>
+              <w:rPr>
+                <w:rStyle w:val="Hipervnculo"/>
+              </w:rPr>
+              <w:t>C.3. Haplotipos minoritarios y diversidad intrahospedador</w:t>
+            </w:r>
+            <w:r>
+              <w:rPr>
+                <w:webHidden/>
+              </w:rPr>
+              <w:tab/>
+            </w:r>
+            <w:r>
+              <w:rPr>
+                <w:webHidden/>
+              </w:rPr>
+              <w:fldChar w:fldCharType="begin"/>
+            </w:r>
+            <w:r>
+              <w:rPr>
+                <w:webHidden/>
+              </w:rPr>
+              <w:instrText xml:space="preserve"> PAGEREF _Toc238736126 \h </w:instrText>
+            </w:r>
+            <w:r>
+              <w:rPr>
+                <w:webHidden/>
+              </w:rPr>
+            </w:r>
+            <w:r>
+              <w:rPr>
+                <w:webHidden/>
+              </w:rPr>
+              <w:fldChar w:fldCharType="separate"/>
+            </w:r>
+            <w:r>
+              <w:rPr>
+                <w:webHidden/>
+              </w:rPr>
               <w:t>92</w:t>
+            </w:r>
+            <w:r>
+              <w:rPr>
+                <w:webHidden/>
+              </w:rPr>
+              <w:fldChar w:fldCharType="end"/>
+            </w:r>
+          </w:hyperlink>
+        </w:p>
+        <w:p>
+          <w:pPr>
+            <w:pStyle w:val="TDC1"/>
+            <w:tabs>
+              <w:tab w:val="right" w:leader="dot" w:pos="9112"/>
+            </w:tabs>
+            <w:rPr>
+              <w:rFonts w:asciiTheme="minorHAnsi" w:hAnsiTheme="minorHAnsi"/>
+              <w:kern w:val="2"/>
+              <w:sz w:val="24"/>
+              <w:szCs w:val="24"/>
+              <w:lang w:eastAsia="es-ES"/>
+              <w14:ligatures w14:val="standardContextual"/>
+            </w:rPr>
+          </w:pPr>
+          <w:hyperlink w:anchor="_Toc238736127" w:history="1">
+            <w:r>
+              <w:rPr>
+                <w:rStyle w:val="Hipervnculo"/>
+              </w:rPr>
+              <w:t>Apéndice D: Reproducibilidad y código</w:t>
+            </w:r>
+            <w:r>
+              <w:rPr>
+                <w:webHidden/>
+              </w:rPr>
+              <w:tab/>
+            </w:r>
+            <w:r>
+              <w:rPr>
+                <w:webHidden/>
+              </w:rPr>
+              <w:fldChar w:fldCharType="begin"/>
+            </w:r>
+            <w:r>
+              <w:rPr>
+                <w:webHidden/>
+              </w:rPr>
+              <w:instrText xml:space="preserve"> PAGEREF _Toc238736127 \h </w:instrText>
+            </w:r>
+            <w:r>
+              <w:rPr>
+                <w:webHidden/>
+              </w:rPr>
+            </w:r>
+            <w:r>
+              <w:rPr>
+                <w:webHidden/>
+              </w:rPr>
+              <w:fldChar w:fldCharType="separate"/>
+            </w:r>
+            <w:r>
+              <w:rPr>
+                <w:webHidden/>
+              </w:rPr>
+              <w:t>93</w:t>
+            </w:r>
+            <w:r>
+              <w:rPr>
+                <w:webHidden/>
+              </w:rPr>
+              <w:fldChar w:fldCharType="end"/>
+            </w:r>
+          </w:hyperlink>
+        </w:p>
+        <w:p>
+          <w:pPr>
+            <w:pStyle w:val="TDC2"/>
+            <w:tabs>
+              <w:tab w:val="right" w:leader="dot" w:pos="9112"/>
+            </w:tabs>
+            <w:rPr>
+              <w:rFonts w:asciiTheme="minorHAnsi" w:hAnsiTheme="minorHAnsi"/>
+              <w:kern w:val="2"/>
+              <w:sz w:val="24"/>
+              <w:szCs w:val="24"/>
+              <w:lang w:eastAsia="es-ES"/>
+              <w14:ligatures w14:val="standardContextual"/>
+            </w:rPr>
+          </w:pPr>
+          <w:hyperlink w:anchor="_Toc238736128" w:history="1">
+            <w:r>
+              <w:rPr>
+                <w:rStyle w:val="Hipervnculo"/>
+              </w:rPr>
+              <w:t>D.1. Mapa entre secciones de la memoria y módulos del notebook</w:t>
+            </w:r>
+            <w:r>
+              <w:rPr>
+                <w:webHidden/>
+              </w:rPr>
+              <w:tab/>
+            </w:r>
+            <w:r>
+              <w:rPr>
+                <w:webHidden/>
+              </w:rPr>
+              <w:fldChar w:fldCharType="begin"/>
+            </w:r>
+            <w:r>
+              <w:rPr>
+                <w:webHidden/>
+              </w:rPr>
+              <w:instrText xml:space="preserve"> PAGEREF _Toc238736128 \h </w:instrText>
+            </w:r>
+            <w:r>
+              <w:rPr>
+                <w:webHidden/>
+              </w:rPr>
+            </w:r>
+            <w:r>
+              <w:rPr>
+                <w:webHidden/>
+              </w:rPr>
+              <w:fldChar w:fldCharType="separate"/>
+            </w:r>
+            <w:r>
+              <w:rPr>
+                <w:webHidden/>
+              </w:rPr>
+              <w:t>93</w:t>
             </w:r>
             <w:r>
               <w:rPr>
@@ -6081,7 +6341,7 @@
       <w:pPr>
         <w:pStyle w:val="Ttulo1"/>
       </w:pPr>
-      <w:bookmarkStart w:id="5" w:name="_Toc238733290"/>
+      <w:bookmarkStart w:id="5" w:name="_Toc238736043"/>
       <w:r>
         <w:lastRenderedPageBreak/>
         <w:t>Glosario</w:t>
@@ -7247,7 +7507,7 @@
         </w:rPr>
       </w:pPr>
       <w:bookmarkStart w:id="6" w:name="_Toc234787600"/>
-      <w:bookmarkStart w:id="7" w:name="_Toc238733291"/>
+      <w:bookmarkStart w:id="7" w:name="_Toc238736044"/>
       <w:r>
         <w:rPr>
           <w:color w:val="1F497D"/>
@@ -7266,7 +7526,7 @@
         </w:rPr>
       </w:pPr>
       <w:bookmarkStart w:id="8" w:name="_Toc234787601"/>
-      <w:bookmarkStart w:id="9" w:name="_Toc238733292"/>
+      <w:bookmarkStart w:id="9" w:name="_Toc238736045"/>
       <w:r>
         <w:rPr>
           <w:color w:val="2E74B5"/>
@@ -7360,7 +7620,7 @@
         </w:rPr>
       </w:pPr>
       <w:bookmarkStart w:id="10" w:name="_Toc234787602"/>
-      <w:bookmarkStart w:id="11" w:name="_Toc238733293"/>
+      <w:bookmarkStart w:id="11" w:name="_Toc238736046"/>
       <w:r>
         <w:rPr>
           <w:color w:val="2E74B5"/>
@@ -7490,7 +7750,7 @@
         </w:rPr>
       </w:pPr>
       <w:bookmarkStart w:id="12" w:name="_Toc234787603"/>
-      <w:bookmarkStart w:id="13" w:name="_Toc238733294"/>
+      <w:bookmarkStart w:id="13" w:name="_Toc238736047"/>
       <w:r>
         <w:rPr>
           <w:color w:val="2E74B5"/>
@@ -7619,7 +7879,7 @@
         </w:rPr>
       </w:pPr>
       <w:bookmarkStart w:id="14" w:name="_Toc234787604"/>
-      <w:bookmarkStart w:id="15" w:name="_Toc238733295"/>
+      <w:bookmarkStart w:id="15" w:name="_Toc238736048"/>
       <w:r>
         <w:rPr>
           <w:color w:val="2E74B5"/>
@@ -7653,7 +7913,7 @@
       <w:pPr>
         <w:pStyle w:val="Ttulo1"/>
       </w:pPr>
-      <w:bookmarkStart w:id="16" w:name="_Toc238733296"/>
+      <w:bookmarkStart w:id="16" w:name="_Toc238736049"/>
       <w:r>
         <w:lastRenderedPageBreak/>
         <w:t>2. Estado del Arte</w:t>
@@ -7672,7 +7932,7 @@
       <w:pPr>
         <w:pStyle w:val="Ttulo2"/>
       </w:pPr>
-      <w:bookmarkStart w:id="17" w:name="_Toc238733297"/>
+      <w:bookmarkStart w:id="17" w:name="_Toc238736050"/>
       <w:r>
         <w:t>2.1. Predicción computacional de la evolución y la eficacia biológica viral</w:t>
       </w:r>
@@ -7683,100 +7943,7 @@
         <w:jc w:val="both"/>
       </w:pPr>
       <w:r>
-        <w:t>La idea de anticipar qué mutaciones o linajes de SARS-CoV-2 van a tener éxito no es nueva: en los últimos años ha aparecido un número creciente de trabajos que abordan el problema desde ángulos muy distintos. Obermeyer et al.</w:t>
-      </w:r>
-      <w:hyperlink w:anchor="ref10" w:history="1">
-        <w:r>
-          <w:rPr>
-            <w:rStyle w:val="Hipervnculo"/>
-          </w:rPr>
-          <w:t>[10]</w:t>
-        </w:r>
-      </w:hyperlink>
-      <w:r>
-        <w:t>estimaron directamente la eficacia biológica relativa de cada mutación a partir de 6,4 millones de genomas mediante un modelo de regresión. Thadani et al.</w:t>
-      </w:r>
-      <w:hyperlink w:anchor="ref11" w:history="1">
-        <w:r>
-          <w:rPr>
-            <w:rStyle w:val="Hipervnculo"/>
-          </w:rPr>
-          <w:t>[11]</w:t>
-        </w:r>
-      </w:hyperlink>
-      <w:r>
-        <w:t>entrenaron un modelo de lenguaje sobre secuencias virales previas a la pandemia (sin ver ni un solo genoma de SARS-CoV-2) y demostraron que aun así predecía qué mutaciones de escape inmune emergerían después, una validación temporal muy próxima en espíritu a la validación progresiva de este trabajo (4.4).</w:t>
-      </w:r>
-    </w:p>
-    <w:p>
-      <w:pPr>
-        <w:jc w:val="both"/>
-      </w:pPr>
-      <w:r>
-        <w:t>Otro grupo de trabajos usa modelos generativos de secuencias: Ramachandran et al.</w:t>
-      </w:r>
-      <w:hyperlink w:anchor="ref12" w:history="1">
-        <w:r>
-          <w:rPr>
-            <w:rStyle w:val="Hipervnculo"/>
-          </w:rPr>
-          <w:t>[12]</w:t>
-        </w:r>
-      </w:hyperlink>
-      <w:r>
-        <w:t>(PandoGen) y Marathe et al.</w:t>
-      </w:r>
-      <w:hyperlink w:anchor="ref13" w:history="1">
-        <w:r>
-          <w:rPr>
-            <w:rStyle w:val="Hipervnculo"/>
-          </w:rPr>
-          <w:t>[13]</w:t>
-        </w:r>
-      </w:hyperlink>
-      <w:r>
-        <w:t>(VirusT5, basado en un modelo de lenguaje de gran tamaño) generan directamente secuencias completas plausibles de variantes futuras, en vez de clasificar variantes ya observadas. Dhodapkar</w:t>
-      </w:r>
-      <w:hyperlink w:anchor="ref14" w:history="1">
-        <w:r>
-          <w:rPr>
-            <w:rStyle w:val="Hipervnculo"/>
-          </w:rPr>
-          <w:t>[14]</w:t>
-        </w:r>
-      </w:hyperlink>
-      <w:r>
-        <w:t>sigue una idea similar con un modelo de lenguaje de proteínas (SpikeGPT2) entrenado solo con secuencias de Spike anteriores a mayo de 2021. Han et al.</w:t>
-      </w:r>
-      <w:hyperlink w:anchor="ref15" w:history="1">
-        <w:r>
-          <w:rPr>
-            <w:rStyle w:val="Hipervnculo"/>
-          </w:rPr>
-          <w:t>[15]</w:t>
-        </w:r>
-      </w:hyperlink>
-      <w:r>
-        <w:t>y Dadonaite et al.</w:t>
-      </w:r>
-      <w:hyperlink w:anchor="ref16" w:history="1">
-        <w:r>
-          <w:rPr>
-            <w:rStyle w:val="Hipervnculo"/>
-          </w:rPr>
-          <w:t>[16]</w:t>
-        </w:r>
-      </w:hyperlink>
-      <w:r>
-        <w:t>, en cambio, se centran en la evolución antigénica y en el escape de anticuerpos: el primero con deep learning sobre datos de neutralización, el segundo combinando deep mutational scanning experimental de Spike con datos poblacionales para predecir qué clados tendrán éxito.</w:t>
-      </w:r>
-    </w:p>
-    <w:p>
-      <w:pPr>
-        <w:jc w:val="both"/>
-      </w:pPr>
-      <w:r>
-        <w:t>El trabajo más parecido a este TFM en escala de datos y en el propio concepto de "umbral de dominancia" es el de Rancati et al.</w:t>
+        <w:t xml:space="preserve">En los últimos años ha aparecido un número creciente de trabajos que intentan anticipar qué mutaciones o linajes de SARS-CoV-2 tendrán éxito, desde modelos de regresión sobre millones de genomas hasta modelos de lenguaje y modelos generativos de secuencias completas. El precedente más cercano a este TFM en escala de datos y en el propio concepto de "umbral de dominancia" es DeepAutoCoV </w:t>
       </w:r>
       <w:hyperlink w:anchor="ref17" w:history="1">
         <w:r>
@@ -7787,25 +7954,25 @@
         </w:r>
       </w:hyperlink>
       <w:r>
-        <w:t xml:space="preserve"> (DeepAutoCoV): usan más de 16 millones de secuencias de Spike de GISAID (una cifra casi idéntica a los ~17 millones de este trabajo) y entrenan un autoencoder no supervisado que detecta como anomalía cualquier linaje que se aleje del patrón habitual, con 4 a 17 semanas de aviso. La diferencia de fondo es metodológica: DeepAutoCoV detecta anomalías sin supervisión, mientras que este trabajo entrena un clasificador supervisado (LightGBM), lo que a cambio de necesitar datos etiquetados permite interpretar qué variables empujan la predicción (2.3, y capítulo de Resultados). Agarwal et al. </w:t>
-      </w:r>
-      <w:hyperlink w:anchor="ref18" w:history="1">
+        <w:t xml:space="preserve">, que usa una cifra de secuencias de GISAID casi idéntica a la de este trabajo pero con un enfoque no supervisado (detección de anomalías) en vez de un clasificador supervisado interpretable como el de este TFM. El detalle de los nueve trabajos revisados está en el </w:t>
+      </w:r>
+      <w:hyperlink w:anchor="apxC1" w:history="1">
         <w:r>
           <w:rPr>
             <w:rStyle w:val="Hipervnculo"/>
           </w:rPr>
-          <w:t>[18]</w:t>
+          <w:t>Apéndice C.1</w:t>
         </w:r>
       </w:hyperlink>
       <w:r>
-        <w:t>plantean el mismo problema para la gripe estacional (FluEvoFormer): un modelo generativo que integra secuencia y estructura de las proteínas de superficie para anticipar la cepa de vacuna de la temporada siguiente, mostrando que el problema no es exclusivo de SARS-CoV-2.</w:t>
+        <w:t>.</w:t>
       </w:r>
     </w:p>
     <w:p>
       <w:pPr>
         <w:pStyle w:val="Ttulo2"/>
       </w:pPr>
-      <w:bookmarkStart w:id="18" w:name="_Toc238733298"/>
+      <w:bookmarkStart w:id="18" w:name="_Toc238736051"/>
       <w:r>
         <w:t>2.2. Sistemas de vigilancia genómica operativos</w:t>
       </w:r>
@@ -7827,11 +7994,7 @@
         </w:r>
       </w:hyperlink>
       <w:r>
-        <w:t xml:space="preserve">entrenan un modelo de gradient boosting sobre 9 millones de secuencias de 30 países para predecir si una variante recién detectada va a provocar una ola significativa de contagios; reportan un AUC de 86,3% a una semana </w:t>
-      </w:r>
-      <w:r>
-        <w:lastRenderedPageBreak/>
-        <w:t>vista y de 90,8% a dos semanas, cifras del mismo orden que las de este trabajo (capítulo de Resultados) aunque sobre una tarea distinta (número de casos, no dominancia relativa del linaje).</w:t>
+        <w:t>entrenan un modelo de gradient boosting sobre 9 millones de secuencias de 30 países para predecir si una variante recién detectada va a provocar una ola significativa de contagios; reportan un AUC de 86,3% a una semana vista y de 90,8% a dos semanas, cifras del mismo orden que las de este trabajo (capítulo de Resultados) aunque sobre una tarea distinta (número de casos, no dominancia relativa del linaje).</w:t>
       </w:r>
     </w:p>
     <w:p>
@@ -7879,7 +8042,7 @@
       <w:pPr>
         <w:pStyle w:val="Ttulo2"/>
       </w:pPr>
-      <w:bookmarkStart w:id="19" w:name="_Toc238733299"/>
+      <w:bookmarkStart w:id="19" w:name="_Toc238736052"/>
       <w:r>
         <w:t>2.3. Gradient boosting: fundamentos y precedentes en genómica</w:t>
       </w:r>
@@ -7901,7 +8064,11 @@
         </w:r>
       </w:hyperlink>
       <w:r>
-        <w:t>es un algoritmo de conjunto basado en árboles de decisión que construye secuencialmente árboles, cada uno de los cuales corrige los errores del conjunto anterior. A diferencia de otras implementaciones de gradient boosting como XGBoost, LightGBM crece los árboles hoja a hoja (elige en cada paso el nodo con mayor ganancia de información, en vez de expandir nivel a nivel), lo que produce árboles más profundos y precisos con el mismo número de hojas. Incorpora además dos optimizaciones propias: Gradient-based One-Side Sampling (GOSS), que reduce cuántos ejemplos hace falta usar en cada árbol sin perder información relevante, y Exclusive Feature Bundling (EFB), que agrupa variables que casi nunca toman valores distintos de cero a la vez. El resultado final no es una única regla de decisión, sino un conjunto de árboles (cada uno con muchas hojas, es decir, muchas reglas) cuyas predicciones se suman con un peso; cuantos más árboles, más fina es la frontera de decisión que el modelo puede aprender.</w:t>
+        <w:t xml:space="preserve">es un algoritmo de conjunto basado en árboles de decisión que construye secuencialmente árboles, cada uno de los cuales corrige los errores del conjunto anterior. A diferencia de otras implementaciones de gradient boosting como XGBoost, LightGBM crece los árboles hoja a hoja (elige en cada paso el nodo con mayor ganancia de información, en vez de expandir nivel a nivel), lo que produce árboles más profundos y precisos con el mismo número de hojas. Incorpora además dos optimizaciones propias: Gradient-based One-Side Sampling (GOSS), que reduce </w:t>
+      </w:r>
+      <w:r>
+        <w:lastRenderedPageBreak/>
+        <w:t>cuántos ejemplos hace falta usar en cada árbol sin perder información relevante, y Exclusive Feature Bundling (EFB), que agrupa variables que casi nunca toman valores distintos de cero a la vez. El resultado final no es una única regla de decisión, sino un conjunto de árboles (cada uno con muchas hojas, es decir, muchas reglas) cuyas predicciones se suman con un peso; cuantos más árboles, más fina es la frontera de decisión que el modelo puede aprender.</w:t>
       </w:r>
     </w:p>
     <w:p>
@@ -7909,62 +8076,25 @@
         <w:jc w:val="both"/>
       </w:pPr>
       <w:r>
-        <w:t>Aplicar gradient boosting a datos genómicos tabulares dispersos y con fuerte desbalance de clases, como los de este TFM, tiene precedente directo en la literatura. Miao et al.</w:t>
-      </w:r>
-      <w:hyperlink w:anchor="ref24" w:history="1">
+        <w:t xml:space="preserve">Aplicar gradient boosting a datos genómicos tabulares, dispersos y con fuerte desbalance de clases, como los de este TFM, tiene precedente directo tanto en genómica viral como en genómica clínica humana y oncológica: varios trabajos usan XGBoost o CatBoost sobre miles de posiciones mutadas para tareas comparables, uno de ellos añadiendo SHAP para interpretabilidad en la misma línea que este TFM. Ninguno aborda evolución viral, pero todos comparten el mismo problema de fondo, para el que el gradient boosting basado en árboles está particularmente bien adaptado frente a alternativas lineales — algo que este TFM confirma empíricamente comparando LightGBM con tres alternativas (7.2.4). El detalle de cada trabajo está en el </w:t>
+      </w:r>
+      <w:hyperlink w:anchor="apxC2" w:history="1">
         <w:r>
           <w:rPr>
             <w:rStyle w:val="Hipervnculo"/>
           </w:rPr>
-          <w:t>[24]</w:t>
+          <w:t>Apéndice C.2</w:t>
         </w:r>
       </w:hyperlink>
       <w:r>
-        <w:t>usan un conjunto de modelos CatBoost (gradient boosting) y random forest para clasificar genomas completos de SARS-CoV-2 en clados y linajes a partir de miles de posiciones mutadas codificadas en one-hot, con downsampling explícito para compensar el desbalance entre linajes minoritarios y mayoritarios. En genómica clínica humana, Zhang et al.</w:t>
-      </w:r>
-      <w:hyperlink w:anchor="ref25" w:history="1">
-        <w:r>
-          <w:rPr>
-            <w:rStyle w:val="Hipervnculo"/>
-          </w:rPr>
-          <w:t>[25]</w:t>
-        </w:r>
-      </w:hyperlink>
-      <w:r>
-        <w:t>(X-CNV) y Dehghan Tezerjani et al.</w:t>
-      </w:r>
-      <w:hyperlink w:anchor="ref26" w:history="1">
-        <w:r>
-          <w:rPr>
-            <w:rStyle w:val="Hipervnculo"/>
-          </w:rPr>
-          <w:t>[26]</w:t>
-        </w:r>
-      </w:hyperlink>
-      <w:r>
-        <w:t xml:space="preserve"> (MetaXVP) entrenan XGBoost sobre decenas de características genéticas dispersas para predecir si una variante es patogénica, el segundo añadiendo SHAP y LIME para interpretabilidad exactamente en la línea de lo que este TFM hace en el capítulo de Resultados; Pellegrino et al. </w:t>
-      </w:r>
-      <w:hyperlink w:anchor="ref27" w:history="1">
-        <w:r>
-          <w:rPr>
-            <w:rStyle w:val="Hipervnculo"/>
-          </w:rPr>
-          <w:t>[27]</w:t>
-        </w:r>
-      </w:hyperlink>
-      <w:r>
-        <w:t xml:space="preserve">aplican el mismo enfoque (XGBoost, con los hiperparámetros ajustados mediante un algoritmo metaheurístico) a la clasificación de variantes somáticas oncológicas detectadas por secuenciación masiva. Ninguno de estos trabajos aborda evolución viral, pero todos comparten con este TFM el mismo problema de fondo: aprender de datos genómicos tabulares, dispersos y desbalanceados, algo para lo que el gradient boosting basado en árboles está particularmente bien adaptado frente a alternativas lineales. Este TFM lo confirma empíricamente: compara LightGBM con regresión logística, random forest y gradient boosting genérico sobre los mismos cuatro conjuntos de datos, encontrando que LightGBM es el algoritmo más consistente en los tres niveles de granularidad del sistema (es decir, en las tres formas de agrupar los </w:t>
-      </w:r>
-      <w:r>
-        <w:lastRenderedPageBreak/>
-        <w:t>datos que usa este TFM: por clado, por familia Pango o por mutación individual, 4.1), aunque no siempre el que gana de media (7.2.4).</w:t>
+        <w:t>.</w:t>
       </w:r>
     </w:p>
     <w:p>
       <w:pPr>
         <w:pStyle w:val="Ttulo2"/>
       </w:pPr>
-      <w:bookmarkStart w:id="20" w:name="_Toc238733300"/>
+      <w:bookmarkStart w:id="20" w:name="_Toc238736053"/>
       <w:r>
         <w:t>2.4. Análisis de supervivencia: fundamentos y aplicaciones a la evolución de patógenos</w:t>
       </w:r>
@@ -8056,7 +8186,7 @@
       <w:pPr>
         <w:pStyle w:val="Ttulo2"/>
       </w:pPr>
-      <w:bookmarkStart w:id="21" w:name="_Toc238733301"/>
+      <w:bookmarkStart w:id="21" w:name="_Toc238736054"/>
       <w:r>
         <w:t>2.5. Haplotipos minoritarios y diversidad intrahospedador como anticipo de la evolución poblacional</w:t>
       </w:r>
@@ -8067,7 +8197,11 @@
         <w:jc w:val="both"/>
       </w:pPr>
       <w:r>
-        <w:t>La hipótesis biológica que motiva este trabajo (validada en 7.6 con datos reales de secuenciación ultra-profunda, CDH) es que la diversidad genética que existe dentro de un mismo paciente infectado, es decir, los haplotipos minoritarios o variantes de baja frecuencia que coexisten con la secuencia dominante y que solo son visibles con una profundidad de secuenciación muy alta, puede anticipar qué mutaciones tendrán éxito después a nivel poblacional. Esta idea tiene una base empírica sólida, construida principalmente a partir de casos clínicos y de cohortes de tamaño moderado.</w:t>
+        <w:t xml:space="preserve">La hipótesis biológica que motiva este trabajo (validada en 7.6 con datos reales de secuenciación ultra-profunda, CDH) es que la diversidad genética que existe dentro de un mismo paciente infectado, es </w:t>
+      </w:r>
+      <w:r>
+        <w:lastRenderedPageBreak/>
+        <w:t>decir, los haplotipos minoritarios o variantes de baja frecuencia que coexisten con la secuencia dominante y que solo son visibles con una profundidad de secuenciación muy alta, puede anticipar qué mutaciones tendrán éxito después a nivel poblacional. Esta idea tiene una base empírica sólida, construida principalmente a partir de casos clínicos y de cohortes de tamaño moderado.</w:t>
       </w:r>
     </w:p>
     <w:p>
@@ -8075,118 +8209,118 @@
         <w:jc w:val="both"/>
       </w:pPr>
       <w:r>
-        <w:t>Los casos más citados en la literatura son de pacientes inmunocomprometidos con infección crónica, en los que la secuenciación longitudinal permitió observar en directo cómo mutaciones de Spike surgían dentro del hospedador y, meses después, aparecían como mutaciones definitorias de variantes de preocupación a nivel mundial. Choi et al.</w:t>
-      </w:r>
-      <w:hyperlink w:anchor="ref33" w:history="1">
+        <w:t xml:space="preserve">Los casos más citados en la literatura son de pacientes inmunocomprometidos con infección crónica, donde la secuenciación longitudinal permitió observar en directo cómo mutaciones de Spike surgían dentro del hospedador y, meses después, aparecían como mutaciones definitorias de variantes de preocupación a nivel mundial; estudios de cohorte más amplios confirman el patrón general, aunque un trabajo sobre gripe estacional matiza que la relación entre diversidad intrahospedador y éxito poblacional no es automática. El grupo de investigación biológica que colabora en este TFM (Perales, Domingo, Martínez-González y colaboradores) ha producido varios de los trabajos más recientes en esta línea, específicamente sobre SARS-CoV-2 y con la metodología CDH que también se usa para la validación biológica de este trabajo. El detalle de los diez trabajos revisados está en el </w:t>
+      </w:r>
+      <w:hyperlink w:anchor="apxC3" w:history="1">
         <w:r>
           <w:rPr>
             <w:rStyle w:val="Hipervnculo"/>
           </w:rPr>
-          <w:t>[33]</w:t>
+          <w:t>Apéndice C.3</w:t>
         </w:r>
       </w:hyperlink>
       <w:r>
-        <w:t>documentaron el primero de estos casos; Kemp et al.</w:t>
-      </w:r>
-      <w:hyperlink w:anchor="ref34" w:history="1">
-        <w:r>
-          <w:rPr>
-            <w:rStyle w:val="Hipervnculo"/>
-          </w:rPr>
-          <w:t>[34]</w:t>
-        </w:r>
-      </w:hyperlink>
-      <w:r>
-        <w:t>mostraron cómo un tratamiento con plasma convaleciente seleccionaba dentro del hospedador mutaciones de Spike que después se observarían en la variante Alpha. A escala de cohorte, Lythgoe et al.</w:t>
-      </w:r>
-      <w:hyperlink w:anchor="ref35" w:history="1">
-        <w:r>
-          <w:rPr>
-            <w:rStyle w:val="Hipervnculo"/>
-          </w:rPr>
-          <w:t>[35]</w:t>
-        </w:r>
-      </w:hyperlink>
-      <w:r>
-        <w:t xml:space="preserve">secuenciaron en profundidad más de mil muestras clínicas del Reino Unido y encontraron que la </w:t>
-      </w:r>
-      <w:r>
+        <w:t>.</w:t>
+      </w:r>
+    </w:p>
+    <w:p>
+      <w:pPr>
+        <w:jc w:val="both"/>
+      </w:pPr>
+      <w:r>
+        <w:t>Tomados en conjunto, estos trabajos establecen que la diversidad intrahospedador puede anticipar, en casos concretos, mutaciones que después triunfan a nivel poblacional, pero la evidencia proviene sobre todo de casos clínicos aislados o de cohortes de cientos de pacientes, no de un sistema que combine esa señal biológica con un clasificador entrenado sobre millones de secuencias poblacionales de GISAID y validado de forma temporal. Esa combinación, entre la escala poblacional de los sistemas descritos en 2.1 y 2.2 y la evidencia biológica intrahospedador descrita en este apartado, es el hueco que este trabajo intenta cubrir.</w:t>
+      </w:r>
+    </w:p>
+    <w:p>
+      <w:r>
+        <w:br w:type="page"/>
+      </w:r>
+    </w:p>
+    <w:p>
+      <w:pPr>
+        <w:pStyle w:val="Ttulo1"/>
+        <w:rPr>
+          <w:color w:val="1F497D"/>
+        </w:rPr>
+      </w:pPr>
+      <w:bookmarkStart w:id="22" w:name="_Toc234787605"/>
+      <w:bookmarkStart w:id="23" w:name="_Toc238736055"/>
+      <w:r>
+        <w:rPr>
+          <w:color w:val="1F497D"/>
+        </w:rPr>
         <w:lastRenderedPageBreak/>
-        <w:t>mayoría de hospedadores tiene muy poca diversidad interna, pero que una minoría con diversidad elevada podría originar variantes con ventaja de transmisión; Valesano et al.</w:t>
-      </w:r>
-      <w:hyperlink w:anchor="ref36" w:history="1">
-        <w:r>
-          <w:rPr>
-            <w:rStyle w:val="Hipervnculo"/>
-          </w:rPr>
-          <w:t>[36]</w:t>
-        </w:r>
-      </w:hyperlink>
-      <w:r>
-        <w:t>llegan a una conclusión compatible en una cohorte distinta, documentando también evolución convergente entre hospedadores. En un virus de ARN distinto, McCrone et al.</w:t>
-      </w:r>
-      <w:hyperlink w:anchor="ref37" w:history="1">
-        <w:r>
-          <w:rPr>
-            <w:rStyle w:val="Hipervnculo"/>
-          </w:rPr>
-          <w:t>[37]</w:t>
-        </w:r>
-      </w:hyperlink>
-      <w:r>
-        <w:t>estudian la gripe estacional y matizan la hipótesis: encuentran que los procesos estocásticos (deriva genética, cuellos de botella de transmisión) dominan sobre la selección direccional, por lo que la relación entre diversidad intrahospedador y éxito poblacional no es automática ni garantizada.</w:t>
-      </w:r>
+        <w:t>3. Marco teórico biológico</w:t>
+      </w:r>
+      <w:bookmarkEnd w:id="22"/>
+      <w:bookmarkEnd w:id="23"/>
+    </w:p>
+    <w:p>
+      <w:pPr>
+        <w:pStyle w:val="Ttulo2"/>
+        <w:rPr>
+          <w:color w:val="2E74B5"/>
+        </w:rPr>
+      </w:pPr>
+      <w:bookmarkStart w:id="24" w:name="_Toc234787606"/>
+      <w:bookmarkStart w:id="25" w:name="_Toc238736056"/>
+      <w:r>
+        <w:rPr>
+          <w:color w:val="2E74B5"/>
+        </w:rPr>
+        <w:t>3.1. SARS-CoV-2: estructura y evolución</w:t>
+      </w:r>
+      <w:bookmarkEnd w:id="24"/>
+      <w:bookmarkEnd w:id="25"/>
     </w:p>
     <w:p>
       <w:pPr>
         <w:jc w:val="both"/>
       </w:pPr>
       <w:r>
-        <w:t>El grupo de investigación biológica que colabora en este TFM (Perales, Domingo, Martínez-González y colaboradores) ha producido varios de los trabajos más recientes en esta línea, específicamente sobre SARS-CoV-2 y con la metodología CDH que también se usa para la validación biológica de este trabajo. de Ávila et al.</w:t>
-      </w:r>
-      <w:hyperlink w:anchor="ref6" w:history="1">
-        <w:r>
-          <w:rPr>
-            <w:rStyle w:val="Hipervnculo"/>
-          </w:rPr>
-          <w:t>[6]</w:t>
-        </w:r>
-      </w:hyperlink>
-      <w:r>
-        <w:t>muestran que los clones biológicos de SARS-CoV-2 son genéticamente heterogéneos, incluyendo posiciones discordantes con el clado consenso asignado. Martínez-González et al.</w:t>
-      </w:r>
-      <w:hyperlink w:anchor="ref7" w:history="1">
-        <w:r>
-          <w:rPr>
-            <w:rStyle w:val="Hipervnculo"/>
-          </w:rPr>
-          <w:t>[7]</w:t>
-        </w:r>
-      </w:hyperlink>
-      <w:r>
-        <w:t>caracterizan el espectro de mutantes a distintos niveles de profundidad de secuenciación, encontrando una abundancia desproporcionada de mutaciones de baja frecuencia; en un trabajo relacionado, el mismo grupo</w:t>
-      </w:r>
-      <w:hyperlink w:anchor="ref8" w:history="1">
-        <w:r>
-          <w:rPr>
-            <w:rStyle w:val="Hipervnculo"/>
-          </w:rPr>
-          <w:t>[8]</w:t>
-        </w:r>
-      </w:hyperlink>
-      <w:r>
-        <w:t>relaciona ese espectro de mutaciones puntuales y deleciones con distintos desenlaces clínicos. Delgado et al.</w:t>
-      </w:r>
-      <w:hyperlink w:anchor="ref9" w:history="1">
-        <w:r>
-          <w:rPr>
-            <w:rStyle w:val="Hipervnculo"/>
-          </w:rPr>
-          <w:t>[9]</w:t>
-        </w:r>
-      </w:hyperlink>
-      <w:r>
-        <w:t>van un paso más allá y usan redes neuronales sobre mapas de haplotipos para identificar diversificación funcional incipiente, evidencia de selección actuando sobre variantes aún no visibles a nivel poblacional; Ferrer-Orta et al.</w:t>
+        <w:t>SARS-CoV-2 es un coronavirus: un virus cuyo material genético es una cadena de ARN (en vez de ADN) y que debe su nombre a la corona de proteínas que sobresalen de su envoltura externa. Pertenece en concreto al género betacoronavirus, el mismo grupo que otros coronavirus humanos ya conocidos antes de la pandemia. Su genoma es una única cadena de ARN de sentido positivo (es decir, puede traducirse directamente a proteínas nada más entrar en la célula) de unas 30.000 posiciones (30 kilobases), uno de los genomas más grandes conocidos entre los virus de ARN. Ese genoma codifica cuatro proteínas estructurales principales, que forman la partícula viral (Spike, Envelope, Membrane y Nucleocápside), y 16 proteínas no estructurales adicionales (NSP1-NSP16), encargadas sobre todo de replicar el genoma dentro de la célula infectada. Este trabajo se centra en dos de ellas: la proteína Spike (S), que sobresale de la superficie del virus y es la que reconoce y permite la entrada en la célula humana, y la ARN polimerasa dependiente de ARN (NSP12, también llamada RdRp), la enzima que copia el genoma viral. Son las dos regiones con mayor relevancia funcional para la evolución pandémica y, por tanto, las que este trabajo trata con mayor detalle.</w:t>
+      </w:r>
+    </w:p>
+    <w:p>
+      <w:pPr>
+        <w:jc w:val="both"/>
+      </w:pPr>
+      <w:r>
+        <w:t xml:space="preserve">La proteína Spike es el principal determinante del tropismo celular y de la capacidad de evasión inmunitaria del SARS-CoV-2. Consta de dos subunidades: S1 (que contiene el dominio N-terminal (NTD) y el dominio de unión al receptor (RBD), residuos 319-541), y S2 (responsable de la fusión de membranas). El RBD establece la interacción directa con el receptor celular ACE2 y es la diana principal de los anticuerpos neutralizantes inducidos tanto por la vacunación como por infecciones previas. Las mutaciones en el RBD que permiten reducir el reconocimiento por estos anticuerpos manteniendo afinidad suficiente por ACE2 confieren una ventaja selectiva, es decir, aumentan su </w:t>
+      </w:r>
+      <w:r>
+        <w:rPr>
+          <w:i/>
+        </w:rPr>
+        <w:t>eficacia biológica</w:t>
+      </w:r>
+      <w:r>
+        <w:t xml:space="preserve"> (</w:t>
+      </w:r>
+      <w:r>
+        <w:rPr>
+          <w:i/>
+        </w:rPr>
+        <w:t>fitness</w:t>
+      </w:r>
+      <w:r>
+        <w:t>: la capacidad relativa de una variante para dejar más descendencia que sus competidoras en un entorno dado), favoreciendo su expansión en una población con inmunidad híbrida derivada de la vacunación y la infección natural.</w:t>
+      </w:r>
+    </w:p>
+    <w:p>
+      <w:pPr>
+        <w:jc w:val="both"/>
+      </w:pPr>
+      <w:r>
+        <w:t>El sitio de corte furina localizado en la posición 681 de Spike (PRRA↓SVAS) constituye otra región sometida a intensa selección positiva. Las sustituciones P681R/H, características de la variante Delta y de diversos sublinajes tardíos de Omicron, favorecen el procesamiento de Spike por la proteasa celular furina, aumentando la eficiencia de fusión y transmisión. En los datos analizados en este trabajo, la mutación Spike_P681R alcanzó una frecuencia global del 94% en la semana de análisis evaluada (enero 2026), confirmando su papel como mutación de fondo del linaje dominante XFG.</w:t>
+      </w:r>
+    </w:p>
+    <w:p>
+      <w:pPr>
+        <w:jc w:val="both"/>
+      </w:pPr>
+      <w:r>
+        <w:t xml:space="preserve">NSP12 (RdRp) es funcionalmente conservada por su papel esencial en la replicación viral, pero no está exenta de variación. Sustituciones como P323L (presente en prácticamente todas las variantes posteriores a la cepa de referencia ancestral) alteran la fidelidad de la replicación, y estudios estructurales confirman que mutaciones puntuales en la interfaz nsp12-nsp8 afectan directamente la actividad de la ARN polimerasa </w:t>
       </w:r>
       <w:hyperlink w:anchor="ref38" w:history="1">
         <w:r>
@@ -8197,51 +8331,8 @@
         </w:r>
       </w:hyperlink>
       <w:r>
-        <w:t>completan el cuadro a nivel estructural, mostrando cómo mutaciones puntuales concretas en la interfaz nsp12-nsp8 alteran directamente la actividad de la polimerasa viral. Por último, Dong et al.</w:t>
-      </w:r>
-      <w:hyperlink w:anchor="ref39" w:history="1">
-        <w:r>
-          <w:rPr>
-            <w:rStyle w:val="Hipervnculo"/>
-          </w:rPr>
-          <w:t>[39]</w:t>
-        </w:r>
-      </w:hyperlink>
-      <w:r>
-        <w:t>aportan la evidencia más reciente y a mayor escala: analizando tres años de secuenciación de más de 96.000 pacientes del consorcio COG-UK, aplican clustering no supervisado sobre los "genomas de variante minoritaria" de cada paciente para identificar posiciones de Spike bajo presión evolutiva activa, en lo que es probablemente el precedente más directo, en escala y en objetivo, de la validación biológica que se presenta en 7.6.</w:t>
-      </w:r>
-    </w:p>
-    <w:p>
-      <w:pPr>
-        <w:jc w:val="both"/>
-      </w:pPr>
-      <w:r>
-        <w:t>Tomados en conjunto, estos trabajos establecen que la diversidad intrahospedador puede anticipar, en casos concretos, mutaciones que después triunfan a nivel poblacional, pero la evidencia proviene sobre todo de casos clínicos aislados o de cohortes de cientos de pacientes, no de un sistema que combine esa señal biológica con un clasificador entrenado sobre millones de secuencias poblacionales de GISAID y validado de forma temporal. Esa combinación, entre la escala poblacional de los sistemas descritos en 2.1 y 2.2 y la evidencia biológica intrahospedador descrita en este apartado, es el hueco que este trabajo intenta cubrir.</w:t>
-      </w:r>
-    </w:p>
-    <w:p>
-      <w:r>
-        <w:br w:type="page"/>
-      </w:r>
-    </w:p>
-    <w:p>
-      <w:pPr>
-        <w:pStyle w:val="Ttulo1"/>
-        <w:rPr>
-          <w:color w:val="1F497D"/>
-        </w:rPr>
-      </w:pPr>
-      <w:bookmarkStart w:id="22" w:name="_Toc234787605"/>
-      <w:bookmarkStart w:id="23" w:name="_Toc238733302"/>
-      <w:r>
-        <w:rPr>
-          <w:color w:val="1F497D"/>
-        </w:rPr>
-        <w:lastRenderedPageBreak/>
-        <w:t>3. Marco teórico biológico</w:t>
-      </w:r>
-      <w:bookmarkEnd w:id="22"/>
-      <w:bookmarkEnd w:id="23"/>
+        <w:t>. La inclusión de mutaciones NSP12 en el análisis (conjuntos de datos M2-SPNSP30 y M3-SPNSP/ALL, definidos en 4.1) busca capturar señales de cambio en la dinámica de replicación que podrían anticipar emergencia.</w:t>
+      </w:r>
     </w:p>
     <w:p>
       <w:pPr>
@@ -8250,87 +8341,8 @@
           <w:color w:val="2E74B5"/>
         </w:rPr>
       </w:pPr>
-      <w:bookmarkStart w:id="24" w:name="_Toc234787606"/>
-      <w:bookmarkStart w:id="25" w:name="_Toc238733303"/>
-      <w:r>
-        <w:rPr>
-          <w:color w:val="2E74B5"/>
-        </w:rPr>
-        <w:t>3.1. SARS-CoV-2: estructura y evolución</w:t>
-      </w:r>
-      <w:bookmarkEnd w:id="24"/>
-      <w:bookmarkEnd w:id="25"/>
-    </w:p>
-    <w:p>
-      <w:pPr>
-        <w:jc w:val="both"/>
-      </w:pPr>
-      <w:r>
-        <w:t>SARS-CoV-2 es un coronavirus: un virus cuyo material genético es una cadena de ARN (en vez de ADN) y que debe su nombre a la corona de proteínas que sobresalen de su envoltura externa. Pertenece en concreto al género betacoronavirus, el mismo grupo que otros coronavirus humanos ya conocidos antes de la pandemia. Su genoma es una única cadena de ARN de sentido positivo (es decir, puede traducirse directamente a proteínas nada más entrar en la célula) de unas 30.000 posiciones (30 kilobases), uno de los genomas más grandes conocidos entre los virus de ARN. Ese genoma codifica cuatro proteínas estructurales principales, que forman la partícula viral (Spike, Envelope, Membrane y Nucleocápside), y 16 proteínas no estructurales adicionales (NSP1-NSP16), encargadas sobre todo de replicar el genoma dentro de la célula infectada. Este trabajo se centra en dos de ellas: la proteína Spike (S), que sobresale de la superficie del virus y es la que reconoce y permite la entrada en la célula humana, y la ARN polimerasa dependiente de ARN (NSP12, también llamada RdRp), la enzima que copia el genoma viral. Son las dos regiones con mayor relevancia funcional para la evolución pandémica y, por tanto, las que este trabajo trata con mayor detalle.</w:t>
-      </w:r>
-    </w:p>
-    <w:p>
-      <w:pPr>
-        <w:jc w:val="both"/>
-      </w:pPr>
-      <w:r>
-        <w:t xml:space="preserve">La proteína Spike es el principal determinante del tropismo celular y de la capacidad de evasión inmunitaria del SARS-CoV-2. Consta de dos subunidades: S1 (que contiene el dominio N-terminal (NTD) y el dominio de unión al receptor (RBD), residuos 319-541), y S2 (responsable de la fusión de membranas). El RBD establece la interacción directa con el receptor celular ACE2 y es la diana principal de los anticuerpos neutralizantes inducidos tanto por la vacunación como por infecciones previas. Las mutaciones en el RBD que permiten reducir el reconocimiento por estos anticuerpos manteniendo afinidad suficiente por ACE2 confieren una ventaja selectiva, es decir, aumentan su </w:t>
-      </w:r>
-      <w:r>
-        <w:rPr>
-          <w:i/>
-        </w:rPr>
-        <w:t>eficacia biológica</w:t>
-      </w:r>
-      <w:r>
-        <w:t xml:space="preserve"> (</w:t>
-      </w:r>
-      <w:r>
-        <w:rPr>
-          <w:i/>
-        </w:rPr>
-        <w:t>fitness</w:t>
-      </w:r>
-      <w:r>
-        <w:t>: la capacidad relativa de una variante para dejar más descendencia que sus competidoras en un entorno dado), favoreciendo su expansión en una población con inmunidad híbrida derivada de la vacunación y la infección natural.</w:t>
-      </w:r>
-    </w:p>
-    <w:p>
-      <w:pPr>
-        <w:jc w:val="both"/>
-      </w:pPr>
-      <w:r>
-        <w:t>El sitio de corte furina localizado en la posición 681 de Spike (PRRA↓SVAS) constituye otra región sometida a intensa selección positiva. Las sustituciones P681R/H, características de la variante Delta y de diversos sublinajes tardíos de Omicron, favorecen el procesamiento de Spike por la proteasa celular furina, aumentando la eficiencia de fusión y transmisión. En los datos analizados en este trabajo, la mutación Spike_P681R alcanzó una frecuencia global del 94% en la semana de análisis evaluada (enero 2026), confirmando su papel como mutación de fondo del linaje dominante XFG.</w:t>
-      </w:r>
-    </w:p>
-    <w:p>
-      <w:pPr>
-        <w:jc w:val="both"/>
-      </w:pPr>
-      <w:r>
-        <w:t xml:space="preserve">NSP12 (RdRp) es funcionalmente conservada por su papel esencial en la replicación viral, pero no está exenta de variación. Sustituciones como P323L (presente en prácticamente todas las variantes posteriores a la cepa de referencia ancestral) alteran la fidelidad de la replicación, y estudios estructurales confirman que mutaciones puntuales en la interfaz nsp12-nsp8 afectan directamente la actividad de la ARN polimerasa </w:t>
-      </w:r>
-      <w:hyperlink w:anchor="ref38" w:history="1">
-        <w:r>
-          <w:rPr>
-            <w:rStyle w:val="Hipervnculo"/>
-          </w:rPr>
-          <w:t>[38]</w:t>
-        </w:r>
-      </w:hyperlink>
-      <w:r>
-        <w:t>. La inclusión de mutaciones NSP12 en el análisis (conjuntos de datos M2-SPNSP30 y M3-SPNSP/ALL, definidos en 4.1) busca capturar señales de cambio en la dinámica de replicación que podrían anticipar emergencia.</w:t>
-      </w:r>
-    </w:p>
-    <w:p>
-      <w:pPr>
-        <w:pStyle w:val="Ttulo2"/>
-        <w:rPr>
-          <w:color w:val="2E74B5"/>
-        </w:rPr>
-      </w:pPr>
       <w:bookmarkStart w:id="26" w:name="_Toc234787607"/>
-      <w:bookmarkStart w:id="27" w:name="_Toc238733304"/>
+      <w:bookmarkStart w:id="27" w:name="_Toc238736057"/>
       <w:r>
         <w:rPr>
           <w:color w:val="2E74B5"/>
@@ -8493,7 +8505,7 @@
         </w:rPr>
       </w:pPr>
       <w:bookmarkStart w:id="28" w:name="_Toc234787608"/>
-      <w:bookmarkStart w:id="29" w:name="_Toc238733305"/>
+      <w:bookmarkStart w:id="29" w:name="_Toc238736058"/>
       <w:r>
         <w:rPr>
           <w:color w:val="2E74B5"/>
@@ -8965,7 +8977,7 @@
         </w:rPr>
       </w:pPr>
       <w:bookmarkStart w:id="30" w:name="_Toc234787609"/>
-      <w:bookmarkStart w:id="31" w:name="_Toc238733306"/>
+      <w:bookmarkStart w:id="31" w:name="_Toc238736059"/>
       <w:r>
         <w:rPr>
           <w:color w:val="2E74B5"/>
@@ -9065,7 +9077,7 @@
         </w:rPr>
       </w:pPr>
       <w:bookmarkStart w:id="32" w:name="_Toc234787610"/>
-      <w:bookmarkStart w:id="33" w:name="_Toc238733307"/>
+      <w:bookmarkStart w:id="33" w:name="_Toc238736060"/>
       <w:r>
         <w:rPr>
           <w:color w:val="1F497D"/>
@@ -9084,7 +9096,7 @@
         </w:rPr>
       </w:pPr>
       <w:bookmarkStart w:id="34" w:name="_Toc234787611"/>
-      <w:bookmarkStart w:id="35" w:name="_Toc238733308"/>
+      <w:bookmarkStart w:id="35" w:name="_Toc238736061"/>
       <w:r>
         <w:rPr>
           <w:color w:val="2E74B5"/>
@@ -9611,7 +9623,7 @@
         </w:rPr>
       </w:pPr>
       <w:bookmarkStart w:id="36" w:name="_Toc234787612"/>
-      <w:bookmarkStart w:id="37" w:name="_Toc238733309"/>
+      <w:bookmarkStart w:id="37" w:name="_Toc238736062"/>
       <w:r>
         <w:rPr>
           <w:color w:val="2E74B5"/>
@@ -9711,7 +9723,7 @@
         </w:rPr>
       </w:pPr>
       <w:bookmarkStart w:id="38" w:name="_Toc234787613"/>
-      <w:bookmarkStart w:id="39" w:name="_Toc238733310"/>
+      <w:bookmarkStart w:id="39" w:name="_Toc238736063"/>
       <w:r>
         <w:rPr>
           <w:color w:val="2E74B5"/>
@@ -9919,7 +9931,7 @@
         </w:rPr>
       </w:pPr>
       <w:bookmarkStart w:id="40" w:name="_Toc234787614"/>
-      <w:bookmarkStart w:id="41" w:name="_Toc238733311"/>
+      <w:bookmarkStart w:id="41" w:name="_Toc238736064"/>
       <w:r>
         <w:rPr>
           <w:color w:val="2E74B5"/>
@@ -10033,7 +10045,7 @@
         </w:rPr>
       </w:pPr>
       <w:bookmarkStart w:id="42" w:name="_Toc234787615"/>
-      <w:bookmarkStart w:id="43" w:name="_Toc238733312"/>
+      <w:bookmarkStart w:id="43" w:name="_Toc238736065"/>
       <w:r>
         <w:rPr>
           <w:color w:val="2E74B5"/>
@@ -10068,7 +10080,7 @@
         </w:rPr>
       </w:pPr>
       <w:bookmarkStart w:id="44" w:name="_Toc234787616"/>
-      <w:bookmarkStart w:id="45" w:name="_Toc238733313"/>
+      <w:bookmarkStart w:id="45" w:name="_Toc238736066"/>
       <w:r>
         <w:rPr>
           <w:color w:val="1F497D"/>
@@ -10087,7 +10099,7 @@
         </w:rPr>
       </w:pPr>
       <w:bookmarkStart w:id="46" w:name="_Toc234787617"/>
-      <w:bookmarkStart w:id="47" w:name="_Toc238733314"/>
+      <w:bookmarkStart w:id="47" w:name="_Toc238736067"/>
       <w:r>
         <w:rPr>
           <w:color w:val="2E74B5"/>
@@ -10121,7 +10133,7 @@
         </w:rPr>
       </w:pPr>
       <w:bookmarkStart w:id="48" w:name="_Toc234787618"/>
-      <w:bookmarkStart w:id="49" w:name="_Toc238733315"/>
+      <w:bookmarkStart w:id="49" w:name="_Toc238736068"/>
       <w:r>
         <w:rPr>
           <w:color w:val="2E74B5"/>
@@ -10187,7 +10199,7 @@
         </w:rPr>
       </w:pPr>
       <w:bookmarkStart w:id="50" w:name="_Toc234787619"/>
-      <w:bookmarkStart w:id="51" w:name="_Toc238733316"/>
+      <w:bookmarkStart w:id="51" w:name="_Toc238736069"/>
       <w:r>
         <w:rPr>
           <w:color w:val="2E74B5"/>
@@ -10955,7 +10967,7 @@
         </w:rPr>
       </w:pPr>
       <w:bookmarkStart w:id="52" w:name="_Toc234787620"/>
-      <w:bookmarkStart w:id="53" w:name="_Toc238733317"/>
+      <w:bookmarkStart w:id="53" w:name="_Toc238736070"/>
       <w:r>
         <w:rPr>
           <w:color w:val="1F497D"/>
@@ -11241,7 +11253,7 @@
         </w:rPr>
       </w:pPr>
       <w:bookmarkStart w:id="54" w:name="_Toc234787621"/>
-      <w:bookmarkStart w:id="55" w:name="_Toc238733318"/>
+      <w:bookmarkStart w:id="55" w:name="_Toc238736071"/>
       <w:r>
         <w:rPr>
           <w:color w:val="2E74B5"/>
@@ -11305,7 +11317,7 @@
         </w:rPr>
       </w:pPr>
       <w:bookmarkStart w:id="56" w:name="_Toc234787622"/>
-      <w:bookmarkStart w:id="57" w:name="_Toc238733319"/>
+      <w:bookmarkStart w:id="57" w:name="_Toc238736072"/>
       <w:r>
         <w:rPr>
           <w:color w:val="2E74B5"/>
@@ -11346,7 +11358,7 @@
         </w:rPr>
       </w:pPr>
       <w:bookmarkStart w:id="58" w:name="_Toc234787623"/>
-      <w:bookmarkStart w:id="59" w:name="_Toc238733320"/>
+      <w:bookmarkStart w:id="59" w:name="_Toc238736073"/>
       <w:r>
         <w:rPr>
           <w:color w:val="2E74B5"/>
@@ -11443,7 +11455,7 @@
         </w:rPr>
       </w:pPr>
       <w:bookmarkStart w:id="60" w:name="_Toc234787624"/>
-      <w:bookmarkStart w:id="61" w:name="_Toc238733321"/>
+      <w:bookmarkStart w:id="61" w:name="_Toc238736074"/>
       <w:r>
         <w:rPr>
           <w:color w:val="2E74B5"/>
@@ -11527,7 +11539,7 @@
         </w:rPr>
       </w:pPr>
       <w:bookmarkStart w:id="62" w:name="_Toc234787625"/>
-      <w:bookmarkStart w:id="63" w:name="_Toc238733322"/>
+      <w:bookmarkStart w:id="63" w:name="_Toc238736075"/>
       <w:r>
         <w:rPr>
           <w:color w:val="2E74B5"/>
@@ -11581,7 +11593,7 @@
         </w:rPr>
       </w:pPr>
       <w:bookmarkStart w:id="64" w:name="_Toc234787626"/>
-      <w:bookmarkStart w:id="65" w:name="_Toc238733323"/>
+      <w:bookmarkStart w:id="65" w:name="_Toc238736076"/>
       <w:r>
         <w:rPr>
           <w:color w:val="1F497D"/>
@@ -11600,7 +11612,7 @@
         </w:rPr>
       </w:pPr>
       <w:bookmarkStart w:id="66" w:name="_Toc234787627"/>
-      <w:bookmarkStart w:id="67" w:name="_Toc238733324"/>
+      <w:bookmarkStart w:id="67" w:name="_Toc238736077"/>
       <w:r>
         <w:rPr>
           <w:color w:val="2E74B5"/>
@@ -11618,7 +11630,7 @@
         <w:rPr>
           <w:i/>
         </w:rPr>
-        <w:t>Los números de módulo del notebook citados originalmente junto a algunos encabezados de este capítulo se han retirado por claridad; el mapa completo entre cada sección de esta memoria y el módulo correspondiente del notebook está en el Apéndice C.</w:t>
+        <w:t>Los números de módulo del notebook citados originalmente junto a algunos encabezados de este capítulo se han retirado por claridad; el mapa completo entre cada sección de esta memoria y el módulo correspondiente del notebook está en el Apéndice D.</w:t>
       </w:r>
     </w:p>
     <w:p>
@@ -11679,7 +11691,7 @@
         </w:rPr>
       </w:pPr>
       <w:bookmarkStart w:id="68" w:name="_Toc234787628"/>
-      <w:bookmarkStart w:id="69" w:name="_Toc238733325"/>
+      <w:bookmarkStart w:id="69" w:name="_Toc238736078"/>
       <w:r>
         <w:rPr>
           <w:color w:val="4F81BD"/>
@@ -11868,7 +11880,7 @@
         </w:rPr>
       </w:pPr>
       <w:bookmarkStart w:id="70" w:name="_Toc234787629"/>
-      <w:bookmarkStart w:id="71" w:name="_Toc238733326"/>
+      <w:bookmarkStart w:id="71" w:name="_Toc238736079"/>
       <w:r>
         <w:rPr>
           <w:color w:val="4F81BD"/>
@@ -11978,7 +11990,7 @@
         </w:rPr>
       </w:pPr>
       <w:bookmarkStart w:id="72" w:name="_Toc234787630"/>
-      <w:bookmarkStart w:id="73" w:name="_Toc238733327"/>
+      <w:bookmarkStart w:id="73" w:name="_Toc238736080"/>
       <w:r>
         <w:rPr>
           <w:color w:val="2E74B5"/>
@@ -11996,7 +12008,7 @@
         </w:rPr>
       </w:pPr>
       <w:bookmarkStart w:id="74" w:name="_Toc234787631"/>
-      <w:bookmarkStart w:id="75" w:name="_Toc238733328"/>
+      <w:bookmarkStart w:id="75" w:name="_Toc238736081"/>
       <w:r>
         <w:rPr>
           <w:color w:val="4F81BD"/>
@@ -13275,7 +13287,7 @@
         </w:rPr>
       </w:pPr>
       <w:bookmarkStart w:id="76" w:name="_Toc234787632"/>
-      <w:bookmarkStart w:id="77" w:name="_Toc238733329"/>
+      <w:bookmarkStart w:id="77" w:name="_Toc238736082"/>
       <w:r>
         <w:rPr>
           <w:color w:val="4F81BD"/>
@@ -14064,7 +14076,7 @@
         </w:rPr>
       </w:pPr>
       <w:bookmarkStart w:id="78" w:name="_Toc234787633"/>
-      <w:bookmarkStart w:id="79" w:name="_Toc238733330"/>
+      <w:bookmarkStart w:id="79" w:name="_Toc238736083"/>
       <w:r>
         <w:rPr>
           <w:color w:val="4F81BD"/>
@@ -14390,7 +14402,7 @@
       <w:pPr>
         <w:pStyle w:val="Ttulo3"/>
       </w:pPr>
-      <w:bookmarkStart w:id="80" w:name="_Toc238733331"/>
+      <w:bookmarkStart w:id="80" w:name="_Toc238736084"/>
       <w:r>
         <w:rPr>
           <w:b w:val="0"/>
@@ -15216,7 +15228,7 @@
         </w:rPr>
       </w:pPr>
       <w:bookmarkStart w:id="81" w:name="_Toc234787634"/>
-      <w:bookmarkStart w:id="82" w:name="_Toc238733332"/>
+      <w:bookmarkStart w:id="82" w:name="_Toc238736085"/>
       <w:r>
         <w:rPr>
           <w:color w:val="2E74B5"/>
@@ -15246,7 +15258,7 @@
         </w:rPr>
       </w:pPr>
       <w:bookmarkStart w:id="83" w:name="_Toc234787635"/>
-      <w:bookmarkStart w:id="84" w:name="_Toc238733333"/>
+      <w:bookmarkStart w:id="84" w:name="_Toc238736086"/>
       <w:r>
         <w:rPr>
           <w:color w:val="4F81BD"/>
@@ -15798,7 +15810,7 @@
         </w:rPr>
       </w:pPr>
       <w:bookmarkStart w:id="85" w:name="_Toc234787636"/>
-      <w:bookmarkStart w:id="86" w:name="_Toc238733334"/>
+      <w:bookmarkStart w:id="86" w:name="_Toc238736087"/>
       <w:r>
         <w:rPr>
           <w:color w:val="4F81BD"/>
@@ -16600,7 +16612,7 @@
         </w:rPr>
       </w:pPr>
       <w:bookmarkStart w:id="87" w:name="_Toc234787637"/>
-      <w:bookmarkStart w:id="88" w:name="_Toc238733335"/>
+      <w:bookmarkStart w:id="88" w:name="_Toc238736088"/>
       <w:r>
         <w:rPr>
           <w:color w:val="2E74B5"/>
@@ -18452,7 +18464,7 @@
         </w:rPr>
       </w:pPr>
       <w:bookmarkStart w:id="89" w:name="_Toc234787638"/>
-      <w:bookmarkStart w:id="90" w:name="_Toc238733336"/>
+      <w:bookmarkStart w:id="90" w:name="_Toc238736089"/>
       <w:r>
         <w:rPr>
           <w:color w:val="2E74B5"/>
@@ -18470,7 +18482,7 @@
         </w:rPr>
       </w:pPr>
       <w:bookmarkStart w:id="91" w:name="_Toc234787639"/>
-      <w:bookmarkStart w:id="92" w:name="_Toc238733337"/>
+      <w:bookmarkStart w:id="92" w:name="_Toc238736090"/>
       <w:r>
         <w:rPr>
           <w:color w:val="4F81BD"/>
@@ -18543,7 +18555,7 @@
         </w:rPr>
       </w:pPr>
       <w:bookmarkStart w:id="93" w:name="_Toc234787640"/>
-      <w:bookmarkStart w:id="94" w:name="_Toc238733338"/>
+      <w:bookmarkStart w:id="94" w:name="_Toc238736091"/>
       <w:r>
         <w:rPr>
           <w:color w:val="4F81BD"/>
@@ -18593,7 +18605,7 @@
         </w:rPr>
       </w:pPr>
       <w:bookmarkStart w:id="95" w:name="_Toc234787641"/>
-      <w:bookmarkStart w:id="96" w:name="_Toc238733339"/>
+      <w:bookmarkStart w:id="96" w:name="_Toc238736092"/>
       <w:r>
         <w:rPr>
           <w:color w:val="4F81BD"/>
@@ -19004,7 +19016,7 @@
         </w:rPr>
       </w:pPr>
       <w:bookmarkStart w:id="97" w:name="_Toc234787642"/>
-      <w:bookmarkStart w:id="98" w:name="_Toc238733340"/>
+      <w:bookmarkStart w:id="98" w:name="_Toc238736093"/>
       <w:r>
         <w:rPr>
           <w:color w:val="2E74B5"/>
@@ -19030,7 +19042,7 @@
         </w:rPr>
       </w:pPr>
       <w:bookmarkStart w:id="99" w:name="_Toc234787643"/>
-      <w:bookmarkStart w:id="100" w:name="_Toc238733341"/>
+      <w:bookmarkStart w:id="100" w:name="_Toc238736094"/>
       <w:r>
         <w:rPr>
           <w:color w:val="4F81BD"/>
@@ -19085,7 +19097,7 @@
         </w:rPr>
       </w:pPr>
       <w:bookmarkStart w:id="101" w:name="_Toc234787645"/>
-      <w:bookmarkStart w:id="102" w:name="_Toc238733342"/>
+      <w:bookmarkStart w:id="102" w:name="_Toc238736095"/>
       <w:r>
         <w:rPr>
           <w:color w:val="2E74B5"/>
@@ -19111,7 +19123,7 @@
         </w:rPr>
       </w:pPr>
       <w:bookmarkStart w:id="103" w:name="_Toc234787648"/>
-      <w:bookmarkStart w:id="104" w:name="_Toc238733343"/>
+      <w:bookmarkStart w:id="104" w:name="_Toc238736096"/>
       <w:r>
         <w:rPr>
           <w:color w:val="4F81BD"/>
@@ -19173,7 +19185,7 @@
         </w:rPr>
       </w:pPr>
       <w:bookmarkStart w:id="105" w:name="_Toc234787649"/>
-      <w:bookmarkStart w:id="106" w:name="_Toc238733344"/>
+      <w:bookmarkStart w:id="106" w:name="_Toc238736097"/>
       <w:r>
         <w:rPr>
           <w:color w:val="4F81BD"/>
@@ -19658,7 +19670,7 @@
         </w:rPr>
       </w:pPr>
       <w:bookmarkStart w:id="107" w:name="_Toc234787650"/>
-      <w:bookmarkStart w:id="108" w:name="_Toc238733345"/>
+      <w:bookmarkStart w:id="108" w:name="_Toc238736098"/>
       <w:r>
         <w:rPr>
           <w:color w:val="2E74B5"/>
@@ -20167,7 +20179,7 @@
         </w:rPr>
       </w:pPr>
       <w:bookmarkStart w:id="109" w:name="_Toc234787651"/>
-      <w:bookmarkStart w:id="110" w:name="_Toc238733346"/>
+      <w:bookmarkStart w:id="110" w:name="_Toc238736099"/>
       <w:r>
         <w:rPr>
           <w:color w:val="4F81BD"/>
@@ -20210,7 +20222,7 @@
         </w:rPr>
       </w:pPr>
       <w:bookmarkStart w:id="111" w:name="_Toc234787652"/>
-      <w:bookmarkStart w:id="112" w:name="_Toc238733347"/>
+      <w:bookmarkStart w:id="112" w:name="_Toc238736100"/>
       <w:r>
         <w:rPr>
           <w:color w:val="4F81BD"/>
@@ -20280,7 +20292,7 @@
         </w:rPr>
       </w:pPr>
       <w:bookmarkStart w:id="113" w:name="_Toc234787653"/>
-      <w:bookmarkStart w:id="114" w:name="_Toc238733348"/>
+      <w:bookmarkStart w:id="114" w:name="_Toc238736101"/>
       <w:r>
         <w:rPr>
           <w:color w:val="1F497D"/>
@@ -20299,7 +20311,7 @@
         </w:rPr>
       </w:pPr>
       <w:bookmarkStart w:id="115" w:name="_Toc234787654"/>
-      <w:bookmarkStart w:id="116" w:name="_Toc238733349"/>
+      <w:bookmarkStart w:id="116" w:name="_Toc238736102"/>
       <w:r>
         <w:rPr>
           <w:color w:val="2E74B5"/>
@@ -20659,7 +20671,7 @@
         </w:rPr>
       </w:pPr>
       <w:bookmarkStart w:id="117" w:name="_Toc234787655"/>
-      <w:bookmarkStart w:id="118" w:name="_Toc238733350"/>
+      <w:bookmarkStart w:id="118" w:name="_Toc238736103"/>
       <w:r>
         <w:rPr>
           <w:color w:val="2E74B5"/>
@@ -20731,7 +20743,7 @@
         </w:rPr>
       </w:pPr>
       <w:bookmarkStart w:id="119" w:name="_Toc234787656"/>
-      <w:bookmarkStart w:id="120" w:name="_Toc238733351"/>
+      <w:bookmarkStart w:id="120" w:name="_Toc238736104"/>
       <w:r>
         <w:rPr>
           <w:color w:val="2E74B5"/>
@@ -20749,7 +20761,7 @@
         </w:rPr>
       </w:pPr>
       <w:bookmarkStart w:id="121" w:name="_Toc234787657"/>
-      <w:bookmarkStart w:id="122" w:name="_Toc238733352"/>
+      <w:bookmarkStart w:id="122" w:name="_Toc238736105"/>
       <w:r>
         <w:rPr>
           <w:color w:val="4F81BD"/>
@@ -20809,7 +20821,7 @@
         </w:rPr>
       </w:pPr>
       <w:bookmarkStart w:id="123" w:name="_Toc234787658"/>
-      <w:bookmarkStart w:id="124" w:name="_Toc238733353"/>
+      <w:bookmarkStart w:id="124" w:name="_Toc238736106"/>
       <w:r>
         <w:rPr>
           <w:color w:val="4F81BD"/>
@@ -20902,7 +20914,7 @@
         </w:rPr>
       </w:pPr>
       <w:bookmarkStart w:id="125" w:name="_Toc234787659"/>
-      <w:bookmarkStart w:id="126" w:name="_Toc238733354"/>
+      <w:bookmarkStart w:id="126" w:name="_Toc238736107"/>
       <w:r>
         <w:rPr>
           <w:color w:val="1F497D"/>
@@ -20921,7 +20933,7 @@
         </w:rPr>
       </w:pPr>
       <w:bookmarkStart w:id="127" w:name="_Toc234787660"/>
-      <w:bookmarkStart w:id="128" w:name="_Toc238733355"/>
+      <w:bookmarkStart w:id="128" w:name="_Toc238736108"/>
       <w:r>
         <w:rPr>
           <w:color w:val="2E74B5"/>
@@ -21145,7 +21157,7 @@
         </w:rPr>
       </w:pPr>
       <w:bookmarkStart w:id="129" w:name="_Toc234787661"/>
-      <w:bookmarkStart w:id="130" w:name="_Toc238733356"/>
+      <w:bookmarkStart w:id="130" w:name="_Toc238736109"/>
       <w:r>
         <w:rPr>
           <w:color w:val="2E74B5"/>
@@ -21272,7 +21284,7 @@
         </w:rPr>
       </w:pPr>
       <w:bookmarkStart w:id="131" w:name="_Toc234787662"/>
-      <w:bookmarkStart w:id="132" w:name="_Toc238733357"/>
+      <w:bookmarkStart w:id="132" w:name="_Toc238736110"/>
       <w:r>
         <w:rPr>
           <w:color w:val="1F497D"/>
@@ -21391,7 +21403,7 @@
         </w:rPr>
       </w:pPr>
       <w:bookmarkStart w:id="133" w:name="_Toc234787669"/>
-      <w:bookmarkStart w:id="134" w:name="_Toc238733358"/>
+      <w:bookmarkStart w:id="134" w:name="_Toc238736111"/>
       <w:r>
         <w:rPr>
           <w:color w:val="1F497D"/>
@@ -22363,7 +22375,7 @@
         </w:rPr>
       </w:pPr>
       <w:bookmarkStart w:id="186" w:name="_Toc234787670"/>
-      <w:bookmarkStart w:id="187" w:name="_Toc238733359"/>
+      <w:bookmarkStart w:id="187" w:name="_Toc238736112"/>
       <w:r>
         <w:rPr>
           <w:color w:val="1F497D"/>
@@ -22383,7 +22395,7 @@
       </w:pPr>
       <w:bookmarkStart w:id="188" w:name="_Toc234787671"/>
       <w:bookmarkStart w:id="189" w:name="apxA1"/>
-      <w:bookmarkStart w:id="190" w:name="_Toc238733360"/>
+      <w:bookmarkStart w:id="190" w:name="_Toc238736113"/>
       <w:r>
         <w:rPr>
           <w:color w:val="2E74B5"/>
@@ -22411,7 +22423,7 @@
       </w:pPr>
       <w:bookmarkStart w:id="191" w:name="_Toc234787672"/>
       <w:bookmarkStart w:id="192" w:name="apxA2"/>
-      <w:bookmarkStart w:id="193" w:name="_Toc238733361"/>
+      <w:bookmarkStart w:id="193" w:name="_Toc238736114"/>
       <w:r>
         <w:rPr>
           <w:color w:val="2E74B5"/>
@@ -22468,7 +22480,7 @@
         </w:rPr>
       </w:pPr>
       <w:bookmarkStart w:id="194" w:name="apxA3"/>
-      <w:bookmarkStart w:id="195" w:name="_Toc238733362"/>
+      <w:bookmarkStart w:id="195" w:name="_Toc238736115"/>
       <w:r>
         <w:rPr>
           <w:color w:val="2E74B5"/>
@@ -22538,7 +22550,7 @@
         </w:rPr>
       </w:pPr>
       <w:bookmarkStart w:id="196" w:name="apxA4"/>
-      <w:bookmarkStart w:id="197" w:name="_Toc238733363"/>
+      <w:bookmarkStart w:id="197" w:name="_Toc238736116"/>
       <w:r>
         <w:rPr>
           <w:color w:val="2E74B5"/>
@@ -22843,7 +22855,7 @@
         <w:pStyle w:val="Ttulo2"/>
       </w:pPr>
       <w:bookmarkStart w:id="198" w:name="apxA5"/>
-      <w:bookmarkStart w:id="199" w:name="_Toc238733364"/>
+      <w:bookmarkStart w:id="199" w:name="_Toc238736117"/>
       <w:r>
         <w:t>A.5. Sensibilidad a los umbrales de dominancia y fijación</w:t>
       </w:r>
@@ -23093,7 +23105,7 @@
           <w:color w:val="1F497D"/>
         </w:rPr>
       </w:pPr>
-      <w:bookmarkStart w:id="200" w:name="_Toc238733365"/>
+      <w:bookmarkStart w:id="200" w:name="_Toc238736118"/>
       <w:r>
         <w:rPr>
           <w:color w:val="1F497D"/>
@@ -23111,7 +23123,7 @@
         </w:rPr>
       </w:pPr>
       <w:bookmarkStart w:id="201" w:name="apxB1"/>
-      <w:bookmarkStart w:id="202" w:name="_Toc238733366"/>
+      <w:bookmarkStart w:id="202" w:name="_Toc238736119"/>
       <w:r>
         <w:rPr>
           <w:color w:val="2E74B5"/>
@@ -23207,7 +23219,7 @@
         </w:rPr>
       </w:pPr>
       <w:bookmarkStart w:id="203" w:name="apxB2"/>
-      <w:bookmarkStart w:id="204" w:name="_Toc238733367"/>
+      <w:bookmarkStart w:id="204" w:name="_Toc238736120"/>
       <w:r>
         <w:rPr>
           <w:color w:val="2E74B5"/>
@@ -23355,7 +23367,7 @@
         <w:pStyle w:val="Ttulo2"/>
       </w:pPr>
       <w:bookmarkStart w:id="205" w:name="apxB3"/>
-      <w:bookmarkStart w:id="206" w:name="_Toc238733368"/>
+      <w:bookmarkStart w:id="206" w:name="_Toc238736121"/>
       <w:r>
         <w:t>B.3. Figuras SHAP adicionales por conjunto de datos</w:t>
       </w:r>
@@ -23652,7 +23664,7 @@
         <w:pStyle w:val="Ttulo2"/>
       </w:pPr>
       <w:bookmarkStart w:id="207" w:name="apxB4"/>
-      <w:bookmarkStart w:id="208" w:name="_Toc238733369"/>
+      <w:bookmarkStart w:id="208" w:name="_Toc238736122"/>
       <w:r>
         <w:t>B.4. Figuras adicionales de validación y supervivencia</w:t>
       </w:r>
@@ -23778,35 +23790,397 @@
       </w:r>
     </w:p>
     <w:p>
+      <w:r>
+        <w:br w:type="page"/>
+      </w:r>
+    </w:p>
+    <w:p>
+      <w:pPr>
+        <w:pStyle w:val="Ttulo1"/>
+      </w:pPr>
+      <w:bookmarkStart w:id="209" w:name="_Toc238736123"/>
+      <w:r>
+        <w:lastRenderedPageBreak/>
+        <w:t>Apéndice C: Precedentes técnicos ampliados</w:t>
+      </w:r>
+      <w:bookmarkEnd w:id="209"/>
+    </w:p>
+    <w:p>
+      <w:pPr>
+        <w:jc w:val="both"/>
+      </w:pPr>
+      <w:r>
+        <w:t>Se recoge aquí, para cada línea de precedentes resumida en el capítulo de Estado del Arte, el detalle completo de los trabajos citados: qué hace cada uno y en qué se parece o se diferencia de este TFM.</w:t>
+      </w:r>
+    </w:p>
+    <w:p>
+      <w:pPr>
+        <w:pStyle w:val="Ttulo2"/>
+      </w:pPr>
+      <w:bookmarkStart w:id="210" w:name="apxC1"/>
+      <w:bookmarkStart w:id="211" w:name="_Toc238736124"/>
+      <w:r>
+        <w:t>C.1. Predicción computacional de la evolución viral</w:t>
+      </w:r>
+      <w:bookmarkEnd w:id="210"/>
+      <w:bookmarkEnd w:id="211"/>
+    </w:p>
+    <w:p>
+      <w:pPr>
+        <w:jc w:val="both"/>
+      </w:pPr>
+      <w:r>
+        <w:t>La idea de anticipar qué mutaciones o linajes de SARS-CoV-2 van a tener éxito no es nueva: en los últimos años ha aparecido un número creciente de trabajos que abordan el problema desde ángulos muy distintos. Obermeyer et al.</w:t>
+      </w:r>
+      <w:hyperlink w:anchor="ref10" w:history="1">
+        <w:r>
+          <w:rPr>
+            <w:rStyle w:val="Hipervnculo"/>
+          </w:rPr>
+          <w:t>[10]</w:t>
+        </w:r>
+      </w:hyperlink>
+      <w:r>
+        <w:t>estimaron directamente la eficacia biológica relativa de cada mutación a partir de 6,4 millones de genomas mediante un modelo de regresión. Thadani et al.</w:t>
+      </w:r>
+      <w:hyperlink w:anchor="ref11" w:history="1">
+        <w:r>
+          <w:rPr>
+            <w:rStyle w:val="Hipervnculo"/>
+          </w:rPr>
+          <w:t>[11]</w:t>
+        </w:r>
+      </w:hyperlink>
+      <w:r>
+        <w:t>entrenaron un modelo de lenguaje sobre secuencias virales previas a la pandemia (sin ver ni un solo genoma de SARS-CoV-2) y demostraron que aun así predecía qué mutaciones de escape inmune emergerían después, una validación temporal muy próxima en espíritu a la validación progresiva de este trabajo (4.4).</w:t>
+      </w:r>
+    </w:p>
+    <w:p>
+      <w:pPr>
+        <w:jc w:val="both"/>
+      </w:pPr>
+      <w:r>
+        <w:t>Otro grupo de trabajos usa modelos generativos de secuencias: Ramachandran et al.</w:t>
+      </w:r>
+      <w:hyperlink w:anchor="ref12" w:history="1">
+        <w:r>
+          <w:rPr>
+            <w:rStyle w:val="Hipervnculo"/>
+          </w:rPr>
+          <w:t>[12]</w:t>
+        </w:r>
+      </w:hyperlink>
+      <w:r>
+        <w:t>(PandoGen) y Marathe et al.</w:t>
+      </w:r>
+      <w:hyperlink w:anchor="ref13" w:history="1">
+        <w:r>
+          <w:rPr>
+            <w:rStyle w:val="Hipervnculo"/>
+          </w:rPr>
+          <w:t>[13]</w:t>
+        </w:r>
+      </w:hyperlink>
+      <w:r>
+        <w:t>(VirusT5, basado en un modelo de lenguaje de gran tamaño) generan directamente secuencias completas plausibles de variantes futuras, en vez de clasificar variantes ya observadas. Dhodapkar</w:t>
+      </w:r>
+      <w:hyperlink w:anchor="ref14" w:history="1">
+        <w:r>
+          <w:rPr>
+            <w:rStyle w:val="Hipervnculo"/>
+          </w:rPr>
+          <w:t>[14]</w:t>
+        </w:r>
+      </w:hyperlink>
+      <w:r>
+        <w:t>sigue una idea similar con un modelo de lenguaje de proteínas (SpikeGPT2) entrenado solo con secuencias de Spike anteriores a mayo de 2021. Han et al.</w:t>
+      </w:r>
+      <w:hyperlink w:anchor="ref15" w:history="1">
+        <w:r>
+          <w:rPr>
+            <w:rStyle w:val="Hipervnculo"/>
+          </w:rPr>
+          <w:t>[15]</w:t>
+        </w:r>
+      </w:hyperlink>
+      <w:r>
+        <w:t>y Dadonaite et al.</w:t>
+      </w:r>
+      <w:hyperlink w:anchor="ref16" w:history="1">
+        <w:r>
+          <w:rPr>
+            <w:rStyle w:val="Hipervnculo"/>
+          </w:rPr>
+          <w:t>[16]</w:t>
+        </w:r>
+      </w:hyperlink>
+      <w:r>
+        <w:t>, en cambio, se centran en la evolución antigénica y en el escape de anticuerpos: el primero con deep learning sobre datos de neutralización, el segundo combinando deep mutational scanning experimental de Spike con datos poblacionales para predecir qué clados tendrán éxito.</w:t>
+      </w:r>
+    </w:p>
+    <w:p>
+      <w:pPr>
+        <w:jc w:val="both"/>
+      </w:pPr>
+      <w:r>
+        <w:t>El trabajo más parecido a este TFM en escala de datos y en el propio concepto de "umbral de dominancia" es el de Rancati et al.</w:t>
+      </w:r>
+      <w:hyperlink w:anchor="ref17" w:history="1">
+        <w:r>
+          <w:rPr>
+            <w:rStyle w:val="Hipervnculo"/>
+          </w:rPr>
+          <w:t>[17]</w:t>
+        </w:r>
+      </w:hyperlink>
+      <w:r>
+        <w:t xml:space="preserve"> (DeepAutoCoV): usan más de 16 millones de secuencias de Spike de GISAID (una cifra casi idéntica a los ~17 millones de este trabajo) y entrenan un autoencoder no supervisado que detecta como anomalía cualquier linaje que se aleje del patrón habitual, con 4 a 17 semanas de aviso. La diferencia de fondo es metodológica: DeepAutoCoV detecta anomalías sin supervisión, mientras que este trabajo entrena un clasificador supervisado (LightGBM), lo que a cambio de necesitar datos etiquetados permite interpretar qué variables empujan la predicción (2.3, y capítulo de Resultados). Agarwal et al. </w:t>
+      </w:r>
+      <w:hyperlink w:anchor="ref18" w:history="1">
+        <w:r>
+          <w:rPr>
+            <w:rStyle w:val="Hipervnculo"/>
+          </w:rPr>
+          <w:t>[18]</w:t>
+        </w:r>
+      </w:hyperlink>
+      <w:r>
+        <w:t>plantean el mismo problema para la gripe estacional (FluEvoFormer): un modelo generativo que integra secuencia y estructura de las proteínas de superficie para anticipar la cepa de vacuna de la temporada siguiente, mostrando que el problema no es exclusivo de SARS-CoV-2.</w:t>
+      </w:r>
+    </w:p>
+    <w:p>
+      <w:pPr>
+        <w:pStyle w:val="Ttulo2"/>
+      </w:pPr>
+      <w:bookmarkStart w:id="212" w:name="apxC2"/>
+      <w:bookmarkStart w:id="213" w:name="_Toc238736125"/>
+      <w:r>
+        <w:t>C.2. Gradient boosting en genómica</w:t>
+      </w:r>
+      <w:bookmarkEnd w:id="212"/>
+      <w:bookmarkEnd w:id="213"/>
+    </w:p>
+    <w:p>
+      <w:pPr>
+        <w:jc w:val="both"/>
+      </w:pPr>
+      <w:r>
+        <w:t>Aplicar gradient boosting a datos genómicos tabulares dispersos y con fuerte desbalance de clases, como los de este TFM, tiene precedente directo en la literatura. Miao et al.</w:t>
+      </w:r>
+      <w:hyperlink w:anchor="ref24" w:history="1">
+        <w:r>
+          <w:rPr>
+            <w:rStyle w:val="Hipervnculo"/>
+          </w:rPr>
+          <w:t>[24]</w:t>
+        </w:r>
+      </w:hyperlink>
+      <w:r>
+        <w:t>usan un conjunto de modelos CatBoost (gradient boosting) y random forest para clasificar genomas completos de SARS-CoV-2 en clados y linajes a partir de miles de posiciones mutadas codificadas en one-hot, con downsampling explícito para compensar el desbalance entre linajes minoritarios y mayoritarios. En genómica clínica humana, Zhang et al.</w:t>
+      </w:r>
+      <w:hyperlink w:anchor="ref25" w:history="1">
+        <w:r>
+          <w:rPr>
+            <w:rStyle w:val="Hipervnculo"/>
+          </w:rPr>
+          <w:t>[25]</w:t>
+        </w:r>
+      </w:hyperlink>
+      <w:r>
+        <w:t>(X-CNV) y Dehghan Tezerjani et al.</w:t>
+      </w:r>
+      <w:hyperlink w:anchor="ref26" w:history="1">
+        <w:r>
+          <w:rPr>
+            <w:rStyle w:val="Hipervnculo"/>
+          </w:rPr>
+          <w:t>[26]</w:t>
+        </w:r>
+      </w:hyperlink>
+      <w:r>
+        <w:t xml:space="preserve"> (MetaXVP) entrenan XGBoost sobre decenas de características genéticas dispersas para predecir si una variante es patogénica, el segundo añadiendo SHAP y LIME para interpretabilidad exactamente en la línea de lo que este TFM hace en el capítulo de Resultados; Pellegrino et al. </w:t>
+      </w:r>
+      <w:hyperlink w:anchor="ref27" w:history="1">
+        <w:r>
+          <w:rPr>
+            <w:rStyle w:val="Hipervnculo"/>
+          </w:rPr>
+          <w:t>[27]</w:t>
+        </w:r>
+      </w:hyperlink>
+      <w:r>
+        <w:t xml:space="preserve">aplican el mismo enfoque </w:t>
+      </w:r>
+      <w:r>
+        <w:lastRenderedPageBreak/>
+        <w:t>(XGBoost, con los hiperparámetros ajustados mediante un algoritmo metaheurístico) a la clasificación de variantes somáticas oncológicas detectadas por secuenciación masiva. Ninguno de estos trabajos aborda evolución viral, pero todos comparten con este TFM el mismo problema de fondo: aprender de datos genómicos tabulares, dispersos y desbalanceados, algo para lo que el gradient boosting basado en árboles está particularmente bien adaptado frente a alternativas lineales. Este TFM lo confirma empíricamente: compara LightGBM con regresión logística, random forest y gradient boosting genérico sobre los mismos cuatro conjuntos de datos, encontrando que LightGBM es el algoritmo más consistente en los tres niveles de granularidad del sistema (es decir, en las tres formas de agrupar los datos que usa este TFM: por clado, por familia Pango o por mutación individual, 4.1), aunque no siempre el que gana de media (7.2.4).</w:t>
+      </w:r>
+    </w:p>
+    <w:p>
+      <w:pPr>
+        <w:pStyle w:val="Ttulo2"/>
+      </w:pPr>
+      <w:bookmarkStart w:id="214" w:name="apxC3"/>
+      <w:bookmarkStart w:id="215" w:name="_Toc238736126"/>
+      <w:r>
+        <w:t>C.3. Haplotipos minoritarios y diversidad intrahospedador</w:t>
+      </w:r>
+      <w:bookmarkEnd w:id="214"/>
+      <w:bookmarkEnd w:id="215"/>
+    </w:p>
+    <w:p>
+      <w:pPr>
+        <w:jc w:val="both"/>
+      </w:pPr>
+      <w:r>
+        <w:t>Los casos más citados en la literatura son de pacientes inmunocomprometidos con infección crónica, en los que la secuenciación longitudinal permitió observar en directo cómo mutaciones de Spike surgían dentro del hospedador y, meses después, aparecían como mutaciones definitorias de variantes de preocupación a nivel mundial. Choi et al.</w:t>
+      </w:r>
+      <w:hyperlink w:anchor="ref33" w:history="1">
+        <w:r>
+          <w:rPr>
+            <w:rStyle w:val="Hipervnculo"/>
+          </w:rPr>
+          <w:t>[33]</w:t>
+        </w:r>
+      </w:hyperlink>
+      <w:r>
+        <w:t>documentaron el primero de estos casos; Kemp et al.</w:t>
+      </w:r>
+      <w:hyperlink w:anchor="ref34" w:history="1">
+        <w:r>
+          <w:rPr>
+            <w:rStyle w:val="Hipervnculo"/>
+          </w:rPr>
+          <w:t>[34]</w:t>
+        </w:r>
+      </w:hyperlink>
+      <w:r>
+        <w:t>mostraron cómo un tratamiento con plasma convaleciente seleccionaba dentro del hospedador mutaciones de Spike que después se observarían en la variante Alpha. A escala de cohorte, Lythgoe et al.</w:t>
+      </w:r>
+      <w:hyperlink w:anchor="ref35" w:history="1">
+        <w:r>
+          <w:rPr>
+            <w:rStyle w:val="Hipervnculo"/>
+          </w:rPr>
+          <w:t>[35]</w:t>
+        </w:r>
+      </w:hyperlink>
+      <w:r>
+        <w:t>secuenciaron en profundidad más de mil muestras clínicas del Reino Unido y encontraron que la mayoría de hospedadores tiene muy poca diversidad interna, pero que una minoría con diversidad elevada podría originar variantes con ventaja de transmisión; Valesano et al.</w:t>
+      </w:r>
+      <w:hyperlink w:anchor="ref36" w:history="1">
+        <w:r>
+          <w:rPr>
+            <w:rStyle w:val="Hipervnculo"/>
+          </w:rPr>
+          <w:t>[36]</w:t>
+        </w:r>
+      </w:hyperlink>
+      <w:r>
+        <w:t>llegan a una conclusión compatible en una cohorte distinta, documentando también evolución convergente entre hospedadores. En un virus de ARN distinto, McCrone et al.</w:t>
+      </w:r>
+      <w:hyperlink w:anchor="ref37" w:history="1">
+        <w:r>
+          <w:rPr>
+            <w:rStyle w:val="Hipervnculo"/>
+          </w:rPr>
+          <w:t>[37]</w:t>
+        </w:r>
+      </w:hyperlink>
+      <w:r>
+        <w:t>estudian la gripe estacional y matizan la hipótesis: encuentran que los procesos estocásticos (deriva genética, cuellos de botella de transmisión) dominan sobre la selección direccional, por lo que la relación entre diversidad intrahospedador y éxito poblacional no es automática ni garantizada.</w:t>
+      </w:r>
+    </w:p>
+    <w:p>
+      <w:pPr>
+        <w:jc w:val="both"/>
+      </w:pPr>
+      <w:r>
+        <w:t>El grupo de investigación biológica que colabora en este TFM (Perales, Domingo, Martínez-González y colaboradores) ha producido varios de los trabajos más recientes en esta línea, específicamente sobre SARS-CoV-2 y con la metodología CDH que también se usa para la validación biológica de este trabajo. de Ávila et al.</w:t>
+      </w:r>
+      <w:hyperlink w:anchor="ref6" w:history="1">
+        <w:r>
+          <w:rPr>
+            <w:rStyle w:val="Hipervnculo"/>
+          </w:rPr>
+          <w:t>[6]</w:t>
+        </w:r>
+      </w:hyperlink>
+      <w:r>
+        <w:t>muestran que los clones biológicos de SARS-CoV-2 son genéticamente heterogéneos, incluyendo posiciones discordantes con el clado consenso asignado. Martínez-González et al.</w:t>
+      </w:r>
+      <w:hyperlink w:anchor="ref7" w:history="1">
+        <w:r>
+          <w:rPr>
+            <w:rStyle w:val="Hipervnculo"/>
+          </w:rPr>
+          <w:t>[7]</w:t>
+        </w:r>
+      </w:hyperlink>
+      <w:r>
+        <w:t>caracterizan el espectro de mutantes a distintos niveles de profundidad de secuenciación, encontrando una abundancia desproporcionada de mutaciones de baja frecuencia; en un trabajo relacionado, el mismo grupo</w:t>
+      </w:r>
+      <w:hyperlink w:anchor="ref8" w:history="1">
+        <w:r>
+          <w:rPr>
+            <w:rStyle w:val="Hipervnculo"/>
+          </w:rPr>
+          <w:t>[8]</w:t>
+        </w:r>
+      </w:hyperlink>
+      <w:r>
+        <w:t>relaciona ese espectro de mutaciones puntuales y deleciones con distintos desenlaces clínicos. Delgado et al.</w:t>
+      </w:r>
+      <w:hyperlink w:anchor="ref9" w:history="1">
+        <w:r>
+          <w:rPr>
+            <w:rStyle w:val="Hipervnculo"/>
+          </w:rPr>
+          <w:t>[9]</w:t>
+        </w:r>
+      </w:hyperlink>
+      <w:r>
+        <w:t>van un paso más allá y usan redes neuronales sobre mapas de haplotipos para identificar diversificación funcional incipiente, evidencia de selección actuando sobre variantes aún no visibles a nivel poblacional; Ferrer-Orta et al.</w:t>
+      </w:r>
+      <w:hyperlink w:anchor="ref38" w:history="1">
+        <w:r>
+          <w:rPr>
+            <w:rStyle w:val="Hipervnculo"/>
+          </w:rPr>
+          <w:t>[38]</w:t>
+        </w:r>
+      </w:hyperlink>
+      <w:r>
+        <w:t>completan el cuadro a nivel estructural, mostrando cómo mutaciones puntuales concretas en la interfaz nsp12-nsp8 alteran directamente la actividad de la polimerasa viral. Por último, Dong et al.</w:t>
+      </w:r>
+      <w:hyperlink w:anchor="ref39" w:history="1">
+        <w:r>
+          <w:rPr>
+            <w:rStyle w:val="Hipervnculo"/>
+          </w:rPr>
+          <w:t>[39]</w:t>
+        </w:r>
+      </w:hyperlink>
+      <w:r>
+        <w:t>aportan la evidencia más reciente y a mayor escala: analizando tres años de secuenciación de más de 96.000 pacientes del consorcio COG-UK, aplican clustering no supervisado sobre los "genomas de variante minoritaria" de cada paciente para identificar posiciones de Spike bajo presión evolutiva activa, en lo que es probablemente el precedente más directo, en escala y en objetivo, de la validación biológica que se presenta en 7.6.</w:t>
+      </w:r>
+    </w:p>
+    <w:p>
       <w:pPr>
         <w:pStyle w:val="Ttulo1"/>
         <w:rPr>
           <w:color w:val="1F497D"/>
         </w:rPr>
       </w:pPr>
-      <w:r>
-        <w:rPr>
-          <w:color w:val="1F497D"/>
-        </w:rPr>
-        <w:br w:type="page"/>
-      </w:r>
-    </w:p>
-    <w:p>
-      <w:pPr>
-        <w:pStyle w:val="Ttulo1"/>
-        <w:rPr>
-          <w:color w:val="1F497D"/>
-        </w:rPr>
-      </w:pPr>
-      <w:bookmarkStart w:id="209" w:name="_Toc238733370"/>
+      <w:bookmarkStart w:id="216" w:name="_Toc238736127"/>
       <w:r>
         <w:rPr>
           <w:color w:val="1F497D"/>
         </w:rPr>
         <w:lastRenderedPageBreak/>
-        <w:t>Apéndice C: Reproducibilidad y código</w:t>
-      </w:r>
-      <w:bookmarkEnd w:id="209"/>
+        <w:t>Apéndice D: Reproducibilidad y código</w:t>
+      </w:r>
+      <w:bookmarkEnd w:id="216"/>
     </w:p>
     <w:p>
       <w:pPr>
@@ -23848,11 +24222,11 @@
       <w:pPr>
         <w:pStyle w:val="Ttulo2"/>
       </w:pPr>
-      <w:bookmarkStart w:id="210" w:name="_Toc238733371"/>
-      <w:r>
-        <w:t>C.1. Mapa entre secciones de la memoria y módulos del notebook</w:t>
-      </w:r>
-      <w:bookmarkEnd w:id="210"/>
+      <w:bookmarkStart w:id="217" w:name="_Toc238736128"/>
+      <w:r>
+        <w:t>D.1. Mapa entre secciones de la memoria y módulos del notebook</w:t>
+      </w:r>
+      <w:bookmarkEnd w:id="217"/>
     </w:p>
     <w:p>
       <w:r>
@@ -36185,6 +36559,138 @@
       <w:b/>
     </w:rPr>
   </w:style>
+  <w:style w:type="paragraph" w:styleId="TDC4">
+    <w:name w:val="toc 4"/>
+    <w:basedOn w:val="Normal"/>
+    <w:next w:val="Normal"/>
+    <w:autoRedefine/>
+    <w:uiPriority w:val="39"/>
+    <w:unhideWhenUsed/>
+    <w:rsid w:val="00E634A7"/>
+    <w:pPr>
+      <w:spacing w:after="100" w:line="278" w:lineRule="auto"/>
+      <w:ind w:left="720"/>
+    </w:pPr>
+    <w:rPr>
+      <w:rFonts w:asciiTheme="minorHAnsi" w:hAnsiTheme="minorHAnsi"/>
+      <w:noProof w:val="0"/>
+      <w:kern w:val="2"/>
+      <w:sz w:val="24"/>
+      <w:szCs w:val="24"/>
+      <w:lang w:eastAsia="es-ES"/>
+      <w14:ligatures w14:val="standardContextual"/>
+    </w:rPr>
+  </w:style>
+  <w:style w:type="paragraph" w:styleId="TDC5">
+    <w:name w:val="toc 5"/>
+    <w:basedOn w:val="Normal"/>
+    <w:next w:val="Normal"/>
+    <w:autoRedefine/>
+    <w:uiPriority w:val="39"/>
+    <w:unhideWhenUsed/>
+    <w:rsid w:val="00E634A7"/>
+    <w:pPr>
+      <w:spacing w:after="100" w:line="278" w:lineRule="auto"/>
+      <w:ind w:left="960"/>
+    </w:pPr>
+    <w:rPr>
+      <w:rFonts w:asciiTheme="minorHAnsi" w:hAnsiTheme="minorHAnsi"/>
+      <w:noProof w:val="0"/>
+      <w:kern w:val="2"/>
+      <w:sz w:val="24"/>
+      <w:szCs w:val="24"/>
+      <w:lang w:eastAsia="es-ES"/>
+      <w14:ligatures w14:val="standardContextual"/>
+    </w:rPr>
+  </w:style>
+  <w:style w:type="paragraph" w:styleId="TDC6">
+    <w:name w:val="toc 6"/>
+    <w:basedOn w:val="Normal"/>
+    <w:next w:val="Normal"/>
+    <w:autoRedefine/>
+    <w:uiPriority w:val="39"/>
+    <w:unhideWhenUsed/>
+    <w:rsid w:val="00E634A7"/>
+    <w:pPr>
+      <w:spacing w:after="100" w:line="278" w:lineRule="auto"/>
+      <w:ind w:left="1200"/>
+    </w:pPr>
+    <w:rPr>
+      <w:rFonts w:asciiTheme="minorHAnsi" w:hAnsiTheme="minorHAnsi"/>
+      <w:noProof w:val="0"/>
+      <w:kern w:val="2"/>
+      <w:sz w:val="24"/>
+      <w:szCs w:val="24"/>
+      <w:lang w:eastAsia="es-ES"/>
+      <w14:ligatures w14:val="standardContextual"/>
+    </w:rPr>
+  </w:style>
+  <w:style w:type="paragraph" w:styleId="TDC7">
+    <w:name w:val="toc 7"/>
+    <w:basedOn w:val="Normal"/>
+    <w:next w:val="Normal"/>
+    <w:autoRedefine/>
+    <w:uiPriority w:val="39"/>
+    <w:unhideWhenUsed/>
+    <w:rsid w:val="00E634A7"/>
+    <w:pPr>
+      <w:spacing w:after="100" w:line="278" w:lineRule="auto"/>
+      <w:ind w:left="1440"/>
+    </w:pPr>
+    <w:rPr>
+      <w:rFonts w:asciiTheme="minorHAnsi" w:hAnsiTheme="minorHAnsi"/>
+      <w:noProof w:val="0"/>
+      <w:kern w:val="2"/>
+      <w:sz w:val="24"/>
+      <w:szCs w:val="24"/>
+      <w:lang w:eastAsia="es-ES"/>
+      <w14:ligatures w14:val="standardContextual"/>
+    </w:rPr>
+  </w:style>
+  <w:style w:type="paragraph" w:styleId="TDC8">
+    <w:name w:val="toc 8"/>
+    <w:basedOn w:val="Normal"/>
+    <w:next w:val="Normal"/>
+    <w:autoRedefine/>
+    <w:uiPriority w:val="39"/>
+    <w:unhideWhenUsed/>
+    <w:rsid w:val="00E634A7"/>
+    <w:pPr>
+      <w:spacing w:after="100" w:line="278" w:lineRule="auto"/>
+      <w:ind w:left="1680"/>
+    </w:pPr>
+    <w:rPr>
+      <w:rFonts w:asciiTheme="minorHAnsi" w:hAnsiTheme="minorHAnsi"/>
+      <w:noProof w:val="0"/>
+      <w:kern w:val="2"/>
+      <w:sz w:val="24"/>
+      <w:szCs w:val="24"/>
+      <w:lang w:eastAsia="es-ES"/>
+      <w14:ligatures w14:val="standardContextual"/>
+    </w:rPr>
+  </w:style>
+  <w:style w:type="paragraph" w:styleId="TDC9">
+    <w:name w:val="toc 9"/>
+    <w:basedOn w:val="Normal"/>
+    <w:next w:val="Normal"/>
+    <w:autoRedefine/>
+    <w:uiPriority w:val="39"/>
+    <w:unhideWhenUsed/>
+    <w:rsid w:val="00E634A7"/>
+    <w:pPr>
+      <w:spacing w:after="100" w:line="278" w:lineRule="auto"/>
+      <w:ind w:left="1920"/>
+    </w:pPr>
+    <w:rPr>
+      <w:rFonts w:asciiTheme="minorHAnsi" w:hAnsiTheme="minorHAnsi"/>
+      <w:noProof w:val="0"/>
+      <w:kern w:val="2"/>
+      <w:sz w:val="24"/>
+      <w:szCs w:val="24"/>
+      <w:lang w:eastAsia="es-ES"/>
+      <w14:ligatures w14:val="standardContextual"/>
+    </w:rPr>
+  </w:style>
 </w:styles>
 </file>
 

</xml_diff>